<commit_message>
regen classifier_report.docx (canonical name)
</commit_message>
<xml_diff>
--- a/results/phase3/classifier_report.docx
+++ b/results/phase3/classifier_report.docx
@@ -30,7 +30,7 @@
     </w:p>
     <w:p>
       <w:r>
-        <w:t>Two tree baselines (LightGBM, RandomForest) tie at macro-F1 0.64 on the classes that are a real generalisation test. Most classes work, but `rock` and `mini_heart` are at 0.00 F1 — every test frame of each is classified as a different class. Those two failures, and their causes, define the Phase 4 work; the model-family choice does not (both trees behave the same).</w:t>
+        <w:t>Two tree baselines were trained independently as candidates for the single classifier slot (section 3). On accuracy they tie — macro-F1 0.64 on the real-generalisation classes. Most classes work, but `rock` and `mini_heart` are at 0.00 F1 — every test frame of each is classified as a different class. Those two failures are data/feature problems, not model-choice problems, and define the Phase 4 work.</w:t>
       </w:r>
     </w:p>
     <w:p>
@@ -74,7 +74,1318 @@
         <w:pStyle w:val="Heading1"/>
       </w:pPr>
       <w:r>
-        <w:t>3. Results</w:t>
+        <w:t>3. LightGBM vs RandomForest — the head-to-head</w:t>
+      </w:r>
+    </w:p>
+    <w:p>
+      <w:r>
+        <w:t>Both trained on the same 62,627-row train.npz, class_weight='balanced', raw 152-d features clipped to +-10. This is the Phase 3 comparison; Phase 4 adds an MLP and locks one.</w:t>
+      </w:r>
+    </w:p>
+    <w:tbl>
+      <w:tblPr>
+        <w:tblStyle w:val="LightGrid-Accent1"/>
+        <w:tblW w:type="auto" w:w="0"/>
+        <w:tblLook w:firstColumn="1" w:firstRow="1" w:lastColumn="0" w:lastRow="0" w:noHBand="0" w:noVBand="1" w:val="04A0"/>
+      </w:tblPr>
+      <w:tblGrid>
+        <w:gridCol w:w="2880"/>
+        <w:gridCol w:w="2880"/>
+        <w:gridCol w:w="2880"/>
+      </w:tblGrid>
+      <w:tr>
+        <w:tc>
+          <w:tcPr>
+            <w:tcW w:type="dxa" w:w="2880"/>
+          </w:tcPr>
+          <w:p>
+            <w:r/>
+            <w:r>
+              <w:rPr>
+                <w:b/>
+                <w:sz w:val="18"/>
+              </w:rPr>
+              <w:t>metric</w:t>
+            </w:r>
+          </w:p>
+        </w:tc>
+        <w:tc>
+          <w:tcPr>
+            <w:tcW w:type="dxa" w:w="2880"/>
+          </w:tcPr>
+          <w:p>
+            <w:r/>
+            <w:r>
+              <w:rPr>
+                <w:b/>
+                <w:sz w:val="18"/>
+              </w:rPr>
+              <w:t>LightGBM</w:t>
+            </w:r>
+          </w:p>
+        </w:tc>
+        <w:tc>
+          <w:tcPr>
+            <w:tcW w:type="dxa" w:w="2880"/>
+          </w:tcPr>
+          <w:p>
+            <w:r/>
+            <w:r>
+              <w:rPr>
+                <w:b/>
+                <w:sz w:val="18"/>
+              </w:rPr>
+              <w:t>RandomForest</w:t>
+            </w:r>
+          </w:p>
+        </w:tc>
+      </w:tr>
+      <w:tr>
+        <w:tc>
+          <w:tcPr>
+            <w:tcW w:type="dxa" w:w="2880"/>
+          </w:tcPr>
+          <w:p>
+            <w:r/>
+            <w:r>
+              <w:rPr>
+                <w:b w:val="0"/>
+                <w:sz w:val="18"/>
+              </w:rPr>
+              <w:t>macro-F1 (all classes)</w:t>
+            </w:r>
+          </w:p>
+        </w:tc>
+        <w:tc>
+          <w:tcPr>
+            <w:tcW w:type="dxa" w:w="2880"/>
+          </w:tcPr>
+          <w:p>
+            <w:r/>
+            <w:r>
+              <w:rPr>
+                <w:b w:val="0"/>
+                <w:sz w:val="18"/>
+              </w:rPr>
+              <w:t>0.745</w:t>
+            </w:r>
+          </w:p>
+        </w:tc>
+        <w:tc>
+          <w:tcPr>
+            <w:tcW w:type="dxa" w:w="2880"/>
+          </w:tcPr>
+          <w:p>
+            <w:r/>
+            <w:r>
+              <w:rPr>
+                <w:b w:val="0"/>
+                <w:sz w:val="18"/>
+              </w:rPr>
+              <w:t>0.748</w:t>
+            </w:r>
+          </w:p>
+        </w:tc>
+      </w:tr>
+      <w:tr>
+        <w:tc>
+          <w:tcPr>
+            <w:tcW w:type="dxa" w:w="2880"/>
+          </w:tcPr>
+          <w:p>
+            <w:r/>
+            <w:r>
+              <w:rPr>
+                <w:b w:val="0"/>
+                <w:sz w:val="18"/>
+              </w:rPr>
+              <w:t>macro-F1 (real-eval only)</w:t>
+            </w:r>
+          </w:p>
+        </w:tc>
+        <w:tc>
+          <w:tcPr>
+            <w:tcW w:type="dxa" w:w="2880"/>
+          </w:tcPr>
+          <w:p>
+            <w:r/>
+            <w:r>
+              <w:rPr>
+                <w:b w:val="0"/>
+                <w:sz w:val="18"/>
+              </w:rPr>
+              <w:t>0.637</w:t>
+            </w:r>
+          </w:p>
+        </w:tc>
+        <w:tc>
+          <w:tcPr>
+            <w:tcW w:type="dxa" w:w="2880"/>
+          </w:tcPr>
+          <w:p>
+            <w:r/>
+            <w:r>
+              <w:rPr>
+                <w:b w:val="0"/>
+                <w:sz w:val="18"/>
+              </w:rPr>
+              <w:t>0.639</w:t>
+            </w:r>
+          </w:p>
+        </w:tc>
+      </w:tr>
+      <w:tr>
+        <w:tc>
+          <w:tcPr>
+            <w:tcW w:type="dxa" w:w="2880"/>
+          </w:tcPr>
+          <w:p>
+            <w:r/>
+            <w:r>
+              <w:rPr>
+                <w:b w:val="0"/>
+                <w:sz w:val="18"/>
+              </w:rPr>
+              <w:t>sit @ s02 recall (only clean cross-person number)</w:t>
+            </w:r>
+          </w:p>
+        </w:tc>
+        <w:tc>
+          <w:tcPr>
+            <w:tcW w:type="dxa" w:w="2880"/>
+          </w:tcPr>
+          <w:p>
+            <w:r/>
+            <w:r>
+              <w:rPr>
+                <w:b w:val="0"/>
+                <w:sz w:val="18"/>
+              </w:rPr>
+              <w:t>0.43</w:t>
+            </w:r>
+          </w:p>
+        </w:tc>
+        <w:tc>
+          <w:tcPr>
+            <w:tcW w:type="dxa" w:w="2880"/>
+          </w:tcPr>
+          <w:p>
+            <w:r/>
+            <w:r>
+              <w:rPr>
+                <w:b w:val="0"/>
+                <w:sz w:val="18"/>
+              </w:rPr>
+              <w:t>0.77</w:t>
+            </w:r>
+          </w:p>
+        </w:tc>
+      </w:tr>
+      <w:tr>
+        <w:tc>
+          <w:tcPr>
+            <w:tcW w:type="dxa" w:w="2880"/>
+          </w:tcPr>
+          <w:p>
+            <w:r/>
+            <w:r>
+              <w:rPr>
+                <w:b w:val="0"/>
+                <w:sz w:val="18"/>
+              </w:rPr>
+              <w:t>fit time</w:t>
+            </w:r>
+          </w:p>
+        </w:tc>
+        <w:tc>
+          <w:tcPr>
+            <w:tcW w:type="dxa" w:w="2880"/>
+          </w:tcPr>
+          <w:p>
+            <w:r/>
+            <w:r>
+              <w:rPr>
+                <w:b w:val="0"/>
+                <w:sz w:val="18"/>
+              </w:rPr>
+              <w:t>118.0 s</w:t>
+            </w:r>
+          </w:p>
+        </w:tc>
+        <w:tc>
+          <w:tcPr>
+            <w:tcW w:type="dxa" w:w="2880"/>
+          </w:tcPr>
+          <w:p>
+            <w:r/>
+            <w:r>
+              <w:rPr>
+                <w:b w:val="0"/>
+                <w:sz w:val="18"/>
+              </w:rPr>
+              <w:t>56.0 s</w:t>
+            </w:r>
+          </w:p>
+        </w:tc>
+      </w:tr>
+      <w:tr>
+        <w:tc>
+          <w:tcPr>
+            <w:tcW w:type="dxa" w:w="2880"/>
+          </w:tcPr>
+          <w:p>
+            <w:r/>
+            <w:r>
+              <w:rPr>
+                <w:b w:val="0"/>
+                <w:sz w:val="18"/>
+              </w:rPr>
+              <w:t>model file size</w:t>
+            </w:r>
+          </w:p>
+        </w:tc>
+        <w:tc>
+          <w:tcPr>
+            <w:tcW w:type="dxa" w:w="2880"/>
+          </w:tcPr>
+          <w:p>
+            <w:r/>
+            <w:r>
+              <w:rPr>
+                <w:b w:val="0"/>
+                <w:sz w:val="18"/>
+              </w:rPr>
+              <w:t>36.2 MB</w:t>
+            </w:r>
+          </w:p>
+        </w:tc>
+        <w:tc>
+          <w:tcPr>
+            <w:tcW w:type="dxa" w:w="2880"/>
+          </w:tcPr>
+          <w:p>
+            <w:r/>
+            <w:r>
+              <w:rPr>
+                <w:b w:val="0"/>
+                <w:sz w:val="18"/>
+              </w:rPr>
+              <w:t>396.3 MB</w:t>
+            </w:r>
+          </w:p>
+        </w:tc>
+      </w:tr>
+    </w:tbl>
+    <w:p>
+      <w:r>
+        <w:t>Per-class F1 (bold = the two differ by &gt; 0.05):</w:t>
+      </w:r>
+    </w:p>
+    <w:tbl>
+      <w:tblPr>
+        <w:tblStyle w:val="LightGrid-Accent1"/>
+        <w:tblW w:type="auto" w:w="0"/>
+        <w:tblLook w:firstColumn="1" w:firstRow="1" w:lastColumn="0" w:lastRow="0" w:noHBand="0" w:noVBand="1" w:val="04A0"/>
+      </w:tblPr>
+      <w:tblGrid>
+        <w:gridCol w:w="2160"/>
+        <w:gridCol w:w="2160"/>
+        <w:gridCol w:w="2160"/>
+        <w:gridCol w:w="2160"/>
+      </w:tblGrid>
+      <w:tr>
+        <w:tc>
+          <w:tcPr>
+            <w:tcW w:type="dxa" w:w="2160"/>
+          </w:tcPr>
+          <w:p>
+            <w:r/>
+            <w:r>
+              <w:rPr>
+                <w:b/>
+                <w:sz w:val="18"/>
+              </w:rPr>
+              <w:t>class</w:t>
+            </w:r>
+          </w:p>
+        </w:tc>
+        <w:tc>
+          <w:tcPr>
+            <w:tcW w:type="dxa" w:w="2160"/>
+          </w:tcPr>
+          <w:p>
+            <w:r/>
+            <w:r>
+              <w:rPr>
+                <w:b/>
+                <w:sz w:val="18"/>
+              </w:rPr>
+              <w:t>LGBM F1</w:t>
+            </w:r>
+          </w:p>
+        </w:tc>
+        <w:tc>
+          <w:tcPr>
+            <w:tcW w:type="dxa" w:w="2160"/>
+          </w:tcPr>
+          <w:p>
+            <w:r/>
+            <w:r>
+              <w:rPr>
+                <w:b/>
+                <w:sz w:val="18"/>
+              </w:rPr>
+              <w:t>RF F1</w:t>
+            </w:r>
+          </w:p>
+        </w:tc>
+        <w:tc>
+          <w:tcPr>
+            <w:tcW w:type="dxa" w:w="2160"/>
+          </w:tcPr>
+          <w:p>
+            <w:r/>
+            <w:r>
+              <w:rPr>
+                <w:b/>
+                <w:sz w:val="18"/>
+              </w:rPr>
+            </w:r>
+          </w:p>
+        </w:tc>
+      </w:tr>
+      <w:tr>
+        <w:tc>
+          <w:tcPr>
+            <w:tcW w:type="dxa" w:w="2160"/>
+          </w:tcPr>
+          <w:p>
+            <w:r/>
+            <w:r>
+              <w:rPr>
+                <w:b w:val="0"/>
+                <w:color w:val="886600"/>
+                <w:sz w:val="18"/>
+              </w:rPr>
+              <w:t>idle</w:t>
+            </w:r>
+          </w:p>
+        </w:tc>
+        <w:tc>
+          <w:tcPr>
+            <w:tcW w:type="dxa" w:w="2160"/>
+          </w:tcPr>
+          <w:p>
+            <w:r/>
+            <w:r>
+              <w:rPr>
+                <w:b w:val="0"/>
+                <w:color w:val="886600"/>
+                <w:sz w:val="18"/>
+              </w:rPr>
+              <w:t>0.59</w:t>
+            </w:r>
+          </w:p>
+        </w:tc>
+        <w:tc>
+          <w:tcPr>
+            <w:tcW w:type="dxa" w:w="2160"/>
+          </w:tcPr>
+          <w:p>
+            <w:r/>
+            <w:r>
+              <w:rPr>
+                <w:b w:val="0"/>
+                <w:color w:val="886600"/>
+                <w:sz w:val="18"/>
+              </w:rPr>
+              <w:t>0.65</w:t>
+            </w:r>
+          </w:p>
+        </w:tc>
+        <w:tc>
+          <w:tcPr>
+            <w:tcW w:type="dxa" w:w="2160"/>
+          </w:tcPr>
+          <w:p>
+            <w:r/>
+            <w:r>
+              <w:rPr>
+                <w:b w:val="0"/>
+                <w:color w:val="886600"/>
+                <w:sz w:val="18"/>
+              </w:rPr>
+              <w:t>*</w:t>
+            </w:r>
+          </w:p>
+        </w:tc>
+      </w:tr>
+      <w:tr>
+        <w:tc>
+          <w:tcPr>
+            <w:tcW w:type="dxa" w:w="2160"/>
+          </w:tcPr>
+          <w:p>
+            <w:r/>
+            <w:r>
+              <w:rPr>
+                <w:b w:val="0"/>
+                <w:sz w:val="18"/>
+              </w:rPr>
+              <w:t>raise_right_hand</w:t>
+            </w:r>
+          </w:p>
+        </w:tc>
+        <w:tc>
+          <w:tcPr>
+            <w:tcW w:type="dxa" w:w="2160"/>
+          </w:tcPr>
+          <w:p>
+            <w:r/>
+            <w:r>
+              <w:rPr>
+                <w:b w:val="0"/>
+                <w:sz w:val="18"/>
+              </w:rPr>
+              <w:t>0.82</w:t>
+            </w:r>
+          </w:p>
+        </w:tc>
+        <w:tc>
+          <w:tcPr>
+            <w:tcW w:type="dxa" w:w="2160"/>
+          </w:tcPr>
+          <w:p>
+            <w:r/>
+            <w:r>
+              <w:rPr>
+                <w:b w:val="0"/>
+                <w:sz w:val="18"/>
+              </w:rPr>
+              <w:t>0.81</w:t>
+            </w:r>
+          </w:p>
+        </w:tc>
+        <w:tc>
+          <w:tcPr>
+            <w:tcW w:type="dxa" w:w="2160"/>
+          </w:tcPr>
+          <w:p>
+            <w:r/>
+            <w:r>
+              <w:rPr>
+                <w:b w:val="0"/>
+                <w:sz w:val="18"/>
+              </w:rPr>
+            </w:r>
+          </w:p>
+        </w:tc>
+      </w:tr>
+      <w:tr>
+        <w:tc>
+          <w:tcPr>
+            <w:tcW w:type="dxa" w:w="2160"/>
+          </w:tcPr>
+          <w:p>
+            <w:r/>
+            <w:r>
+              <w:rPr>
+                <w:b w:val="0"/>
+                <w:sz w:val="18"/>
+              </w:rPr>
+              <w:t>raise_left_hand</w:t>
+            </w:r>
+          </w:p>
+        </w:tc>
+        <w:tc>
+          <w:tcPr>
+            <w:tcW w:type="dxa" w:w="2160"/>
+          </w:tcPr>
+          <w:p>
+            <w:r/>
+            <w:r>
+              <w:rPr>
+                <w:b w:val="0"/>
+                <w:sz w:val="18"/>
+              </w:rPr>
+              <w:t>0.91</w:t>
+            </w:r>
+          </w:p>
+        </w:tc>
+        <w:tc>
+          <w:tcPr>
+            <w:tcW w:type="dxa" w:w="2160"/>
+          </w:tcPr>
+          <w:p>
+            <w:r/>
+            <w:r>
+              <w:rPr>
+                <w:b w:val="0"/>
+                <w:sz w:val="18"/>
+              </w:rPr>
+              <w:t>0.90</w:t>
+            </w:r>
+          </w:p>
+        </w:tc>
+        <w:tc>
+          <w:tcPr>
+            <w:tcW w:type="dxa" w:w="2160"/>
+          </w:tcPr>
+          <w:p>
+            <w:r/>
+            <w:r>
+              <w:rPr>
+                <w:b w:val="0"/>
+                <w:sz w:val="18"/>
+              </w:rPr>
+            </w:r>
+          </w:p>
+        </w:tc>
+      </w:tr>
+      <w:tr>
+        <w:tc>
+          <w:tcPr>
+            <w:tcW w:type="dxa" w:w="2160"/>
+          </w:tcPr>
+          <w:p>
+            <w:r/>
+            <w:r>
+              <w:rPr>
+                <w:b w:val="0"/>
+                <w:sz w:val="18"/>
+              </w:rPr>
+              <w:t>sit</w:t>
+            </w:r>
+          </w:p>
+        </w:tc>
+        <w:tc>
+          <w:tcPr>
+            <w:tcW w:type="dxa" w:w="2160"/>
+          </w:tcPr>
+          <w:p>
+            <w:r/>
+            <w:r>
+              <w:rPr>
+                <w:b w:val="0"/>
+                <w:sz w:val="18"/>
+              </w:rPr>
+              <w:t>0.95</w:t>
+            </w:r>
+          </w:p>
+        </w:tc>
+        <w:tc>
+          <w:tcPr>
+            <w:tcW w:type="dxa" w:w="2160"/>
+          </w:tcPr>
+          <w:p>
+            <w:r/>
+            <w:r>
+              <w:rPr>
+                <w:b w:val="0"/>
+                <w:sz w:val="18"/>
+              </w:rPr>
+              <w:t>0.98</w:t>
+            </w:r>
+          </w:p>
+        </w:tc>
+        <w:tc>
+          <w:tcPr>
+            <w:tcW w:type="dxa" w:w="2160"/>
+          </w:tcPr>
+          <w:p>
+            <w:r/>
+            <w:r>
+              <w:rPr>
+                <w:b w:val="0"/>
+                <w:sz w:val="18"/>
+              </w:rPr>
+            </w:r>
+          </w:p>
+        </w:tc>
+      </w:tr>
+      <w:tr>
+        <w:tc>
+          <w:tcPr>
+            <w:tcW w:type="dxa" w:w="2160"/>
+          </w:tcPr>
+          <w:p>
+            <w:r/>
+            <w:r>
+              <w:rPr>
+                <w:b w:val="0"/>
+                <w:sz w:val="18"/>
+              </w:rPr>
+              <w:t>squat</w:t>
+            </w:r>
+          </w:p>
+        </w:tc>
+        <w:tc>
+          <w:tcPr>
+            <w:tcW w:type="dxa" w:w="2160"/>
+          </w:tcPr>
+          <w:p>
+            <w:r/>
+            <w:r>
+              <w:rPr>
+                <w:b w:val="0"/>
+                <w:sz w:val="18"/>
+              </w:rPr>
+              <w:t>1.00</w:t>
+            </w:r>
+          </w:p>
+        </w:tc>
+        <w:tc>
+          <w:tcPr>
+            <w:tcW w:type="dxa" w:w="2160"/>
+          </w:tcPr>
+          <w:p>
+            <w:r/>
+            <w:r>
+              <w:rPr>
+                <w:b w:val="0"/>
+                <w:sz w:val="18"/>
+              </w:rPr>
+              <w:t>1.00</w:t>
+            </w:r>
+          </w:p>
+        </w:tc>
+        <w:tc>
+          <w:tcPr>
+            <w:tcW w:type="dxa" w:w="2160"/>
+          </w:tcPr>
+          <w:p>
+            <w:r/>
+            <w:r>
+              <w:rPr>
+                <w:b w:val="0"/>
+                <w:sz w:val="18"/>
+              </w:rPr>
+            </w:r>
+          </w:p>
+        </w:tc>
+      </w:tr>
+      <w:tr>
+        <w:tc>
+          <w:tcPr>
+            <w:tcW w:type="dxa" w:w="2160"/>
+          </w:tcPr>
+          <w:p>
+            <w:r/>
+            <w:r>
+              <w:rPr>
+                <w:b w:val="0"/>
+                <w:sz w:val="18"/>
+              </w:rPr>
+              <w:t>laying</w:t>
+            </w:r>
+          </w:p>
+        </w:tc>
+        <w:tc>
+          <w:tcPr>
+            <w:tcW w:type="dxa" w:w="2160"/>
+          </w:tcPr>
+          <w:p>
+            <w:r/>
+            <w:r>
+              <w:rPr>
+                <w:b w:val="0"/>
+                <w:sz w:val="18"/>
+              </w:rPr>
+              <w:t>1.00</w:t>
+            </w:r>
+          </w:p>
+        </w:tc>
+        <w:tc>
+          <w:tcPr>
+            <w:tcW w:type="dxa" w:w="2160"/>
+          </w:tcPr>
+          <w:p>
+            <w:r/>
+            <w:r>
+              <w:rPr>
+                <w:b w:val="0"/>
+                <w:sz w:val="18"/>
+              </w:rPr>
+              <w:t>1.00</w:t>
+            </w:r>
+          </w:p>
+        </w:tc>
+        <w:tc>
+          <w:tcPr>
+            <w:tcW w:type="dxa" w:w="2160"/>
+          </w:tcPr>
+          <w:p>
+            <w:r/>
+            <w:r>
+              <w:rPr>
+                <w:b w:val="0"/>
+                <w:sz w:val="18"/>
+              </w:rPr>
+            </w:r>
+          </w:p>
+        </w:tc>
+      </w:tr>
+      <w:tr>
+        <w:tc>
+          <w:tcPr>
+            <w:tcW w:type="dxa" w:w="2160"/>
+          </w:tcPr>
+          <w:p>
+            <w:r/>
+            <w:r>
+              <w:rPr>
+                <w:b w:val="0"/>
+                <w:sz w:val="18"/>
+              </w:rPr>
+              <w:t>ok</w:t>
+            </w:r>
+          </w:p>
+        </w:tc>
+        <w:tc>
+          <w:tcPr>
+            <w:tcW w:type="dxa" w:w="2160"/>
+          </w:tcPr>
+          <w:p>
+            <w:r/>
+            <w:r>
+              <w:rPr>
+                <w:b w:val="0"/>
+                <w:sz w:val="18"/>
+              </w:rPr>
+              <w:t>0.77</w:t>
+            </w:r>
+          </w:p>
+        </w:tc>
+        <w:tc>
+          <w:tcPr>
+            <w:tcW w:type="dxa" w:w="2160"/>
+          </w:tcPr>
+          <w:p>
+            <w:r/>
+            <w:r>
+              <w:rPr>
+                <w:b w:val="0"/>
+                <w:sz w:val="18"/>
+              </w:rPr>
+              <w:t>0.77</w:t>
+            </w:r>
+          </w:p>
+        </w:tc>
+        <w:tc>
+          <w:tcPr>
+            <w:tcW w:type="dxa" w:w="2160"/>
+          </w:tcPr>
+          <w:p>
+            <w:r/>
+            <w:r>
+              <w:rPr>
+                <w:b w:val="0"/>
+                <w:sz w:val="18"/>
+              </w:rPr>
+            </w:r>
+          </w:p>
+        </w:tc>
+      </w:tr>
+      <w:tr>
+        <w:tc>
+          <w:tcPr>
+            <w:tcW w:type="dxa" w:w="2160"/>
+          </w:tcPr>
+          <w:p>
+            <w:r/>
+            <w:r>
+              <w:rPr>
+                <w:b w:val="0"/>
+                <w:sz w:val="18"/>
+              </w:rPr>
+              <w:t>i_love_you</w:t>
+            </w:r>
+          </w:p>
+        </w:tc>
+        <w:tc>
+          <w:tcPr>
+            <w:tcW w:type="dxa" w:w="2160"/>
+          </w:tcPr>
+          <w:p>
+            <w:r/>
+            <w:r>
+              <w:rPr>
+                <w:b w:val="0"/>
+                <w:sz w:val="18"/>
+              </w:rPr>
+              <w:t>0.68</w:t>
+            </w:r>
+          </w:p>
+        </w:tc>
+        <w:tc>
+          <w:tcPr>
+            <w:tcW w:type="dxa" w:w="2160"/>
+          </w:tcPr>
+          <w:p>
+            <w:r/>
+            <w:r>
+              <w:rPr>
+                <w:b w:val="0"/>
+                <w:sz w:val="18"/>
+              </w:rPr>
+              <w:t>0.69</w:t>
+            </w:r>
+          </w:p>
+        </w:tc>
+        <w:tc>
+          <w:tcPr>
+            <w:tcW w:type="dxa" w:w="2160"/>
+          </w:tcPr>
+          <w:p>
+            <w:r/>
+            <w:r>
+              <w:rPr>
+                <w:b w:val="0"/>
+                <w:sz w:val="18"/>
+              </w:rPr>
+            </w:r>
+          </w:p>
+        </w:tc>
+      </w:tr>
+      <w:tr>
+        <w:tc>
+          <w:tcPr>
+            <w:tcW w:type="dxa" w:w="2160"/>
+          </w:tcPr>
+          <w:p>
+            <w:r/>
+            <w:r>
+              <w:rPr>
+                <w:b w:val="0"/>
+                <w:sz w:val="18"/>
+              </w:rPr>
+              <w:t>rock</w:t>
+            </w:r>
+          </w:p>
+        </w:tc>
+        <w:tc>
+          <w:tcPr>
+            <w:tcW w:type="dxa" w:w="2160"/>
+          </w:tcPr>
+          <w:p>
+            <w:r/>
+            <w:r>
+              <w:rPr>
+                <w:b w:val="0"/>
+                <w:sz w:val="18"/>
+              </w:rPr>
+              <w:t>0.00</w:t>
+            </w:r>
+          </w:p>
+        </w:tc>
+        <w:tc>
+          <w:tcPr>
+            <w:tcW w:type="dxa" w:w="2160"/>
+          </w:tcPr>
+          <w:p>
+            <w:r/>
+            <w:r>
+              <w:rPr>
+                <w:b w:val="0"/>
+                <w:sz w:val="18"/>
+              </w:rPr>
+              <w:t>0.00</w:t>
+            </w:r>
+          </w:p>
+        </w:tc>
+        <w:tc>
+          <w:tcPr>
+            <w:tcW w:type="dxa" w:w="2160"/>
+          </w:tcPr>
+          <w:p>
+            <w:r/>
+            <w:r>
+              <w:rPr>
+                <w:b w:val="0"/>
+                <w:sz w:val="18"/>
+              </w:rPr>
+            </w:r>
+          </w:p>
+        </w:tc>
+      </w:tr>
+      <w:tr>
+        <w:tc>
+          <w:tcPr>
+            <w:tcW w:type="dxa" w:w="2160"/>
+          </w:tcPr>
+          <w:p>
+            <w:r/>
+            <w:r>
+              <w:rPr>
+                <w:b w:val="0"/>
+                <w:sz w:val="18"/>
+              </w:rPr>
+              <w:t>two_finger</w:t>
+            </w:r>
+          </w:p>
+        </w:tc>
+        <w:tc>
+          <w:tcPr>
+            <w:tcW w:type="dxa" w:w="2160"/>
+          </w:tcPr>
+          <w:p>
+            <w:r/>
+            <w:r>
+              <w:rPr>
+                <w:b w:val="0"/>
+                <w:sz w:val="18"/>
+              </w:rPr>
+              <w:t>0.83</w:t>
+            </w:r>
+          </w:p>
+        </w:tc>
+        <w:tc>
+          <w:tcPr>
+            <w:tcW w:type="dxa" w:w="2160"/>
+          </w:tcPr>
+          <w:p>
+            <w:r/>
+            <w:r>
+              <w:rPr>
+                <w:b w:val="0"/>
+                <w:sz w:val="18"/>
+              </w:rPr>
+              <w:t>0.81</w:t>
+            </w:r>
+          </w:p>
+        </w:tc>
+        <w:tc>
+          <w:tcPr>
+            <w:tcW w:type="dxa" w:w="2160"/>
+          </w:tcPr>
+          <w:p>
+            <w:r/>
+            <w:r>
+              <w:rPr>
+                <w:b w:val="0"/>
+                <w:sz w:val="18"/>
+              </w:rPr>
+            </w:r>
+          </w:p>
+        </w:tc>
+      </w:tr>
+      <w:tr>
+        <w:tc>
+          <w:tcPr>
+            <w:tcW w:type="dxa" w:w="2160"/>
+          </w:tcPr>
+          <w:p>
+            <w:r/>
+            <w:r>
+              <w:rPr>
+                <w:b w:val="0"/>
+                <w:sz w:val="18"/>
+              </w:rPr>
+              <w:t>thumb</w:t>
+            </w:r>
+          </w:p>
+        </w:tc>
+        <w:tc>
+          <w:tcPr>
+            <w:tcW w:type="dxa" w:w="2160"/>
+          </w:tcPr>
+          <w:p>
+            <w:r/>
+            <w:r>
+              <w:rPr>
+                <w:b w:val="0"/>
+                <w:sz w:val="18"/>
+              </w:rPr>
+              <w:t>0.98</w:t>
+            </w:r>
+          </w:p>
+        </w:tc>
+        <w:tc>
+          <w:tcPr>
+            <w:tcW w:type="dxa" w:w="2160"/>
+          </w:tcPr>
+          <w:p>
+            <w:r/>
+            <w:r>
+              <w:rPr>
+                <w:b w:val="0"/>
+                <w:sz w:val="18"/>
+              </w:rPr>
+              <w:t>0.97</w:t>
+            </w:r>
+          </w:p>
+        </w:tc>
+        <w:tc>
+          <w:tcPr>
+            <w:tcW w:type="dxa" w:w="2160"/>
+          </w:tcPr>
+          <w:p>
+            <w:r/>
+            <w:r>
+              <w:rPr>
+                <w:b w:val="0"/>
+                <w:sz w:val="18"/>
+              </w:rPr>
+            </w:r>
+          </w:p>
+        </w:tc>
+      </w:tr>
+      <w:tr>
+        <w:tc>
+          <w:tcPr>
+            <w:tcW w:type="dxa" w:w="2160"/>
+          </w:tcPr>
+          <w:p>
+            <w:r/>
+            <w:r>
+              <w:rPr>
+                <w:b w:val="0"/>
+                <w:sz w:val="18"/>
+              </w:rPr>
+              <w:t>heart</w:t>
+            </w:r>
+          </w:p>
+        </w:tc>
+        <w:tc>
+          <w:tcPr>
+            <w:tcW w:type="dxa" w:w="2160"/>
+          </w:tcPr>
+          <w:p>
+            <w:r/>
+            <w:r>
+              <w:rPr>
+                <w:b w:val="0"/>
+                <w:sz w:val="18"/>
+              </w:rPr>
+              <w:t>0.81</w:t>
+            </w:r>
+          </w:p>
+        </w:tc>
+        <w:tc>
+          <w:tcPr>
+            <w:tcW w:type="dxa" w:w="2160"/>
+          </w:tcPr>
+          <w:p>
+            <w:r/>
+            <w:r>
+              <w:rPr>
+                <w:b w:val="0"/>
+                <w:sz w:val="18"/>
+              </w:rPr>
+              <w:t>0.81</w:t>
+            </w:r>
+          </w:p>
+        </w:tc>
+        <w:tc>
+          <w:tcPr>
+            <w:tcW w:type="dxa" w:w="2160"/>
+          </w:tcPr>
+          <w:p>
+            <w:r/>
+            <w:r>
+              <w:rPr>
+                <w:b w:val="0"/>
+                <w:sz w:val="18"/>
+              </w:rPr>
+            </w:r>
+          </w:p>
+        </w:tc>
+      </w:tr>
+      <w:tr>
+        <w:tc>
+          <w:tcPr>
+            <w:tcW w:type="dxa" w:w="2160"/>
+          </w:tcPr>
+          <w:p>
+            <w:r/>
+            <w:r>
+              <w:rPr>
+                <w:b w:val="0"/>
+                <w:sz w:val="18"/>
+              </w:rPr>
+              <w:t>mini_heart</w:t>
+            </w:r>
+          </w:p>
+        </w:tc>
+        <w:tc>
+          <w:tcPr>
+            <w:tcW w:type="dxa" w:w="2160"/>
+          </w:tcPr>
+          <w:p>
+            <w:r/>
+            <w:r>
+              <w:rPr>
+                <w:b w:val="0"/>
+                <w:sz w:val="18"/>
+              </w:rPr>
+              <w:t>0.00</w:t>
+            </w:r>
+          </w:p>
+        </w:tc>
+        <w:tc>
+          <w:tcPr>
+            <w:tcW w:type="dxa" w:w="2160"/>
+          </w:tcPr>
+          <w:p>
+            <w:r/>
+            <w:r>
+              <w:rPr>
+                <w:b w:val="0"/>
+                <w:sz w:val="18"/>
+              </w:rPr>
+              <w:t>0.00</w:t>
+            </w:r>
+          </w:p>
+        </w:tc>
+        <w:tc>
+          <w:tcPr>
+            <w:tcW w:type="dxa" w:w="2160"/>
+          </w:tcPr>
+          <w:p>
+            <w:r/>
+            <w:r>
+              <w:rPr>
+                <w:b w:val="0"/>
+                <w:sz w:val="18"/>
+              </w:rPr>
+            </w:r>
+          </w:p>
+        </w:tc>
+      </w:tr>
+      <w:tr>
+        <w:tc>
+          <w:tcPr>
+            <w:tcW w:type="dxa" w:w="2160"/>
+          </w:tcPr>
+          <w:p>
+            <w:r/>
+            <w:r>
+              <w:rPr>
+                <w:b w:val="0"/>
+                <w:sz w:val="18"/>
+              </w:rPr>
+              <w:t>t_pose</w:t>
+            </w:r>
+          </w:p>
+        </w:tc>
+        <w:tc>
+          <w:tcPr>
+            <w:tcW w:type="dxa" w:w="2160"/>
+          </w:tcPr>
+          <w:p>
+            <w:r/>
+            <w:r>
+              <w:rPr>
+                <w:b w:val="0"/>
+                <w:sz w:val="18"/>
+              </w:rPr>
+              <w:t>0.84</w:t>
+            </w:r>
+          </w:p>
+        </w:tc>
+        <w:tc>
+          <w:tcPr>
+            <w:tcW w:type="dxa" w:w="2160"/>
+          </w:tcPr>
+          <w:p>
+            <w:r/>
+            <w:r>
+              <w:rPr>
+                <w:b w:val="0"/>
+                <w:sz w:val="18"/>
+              </w:rPr>
+              <w:t>0.84</w:t>
+            </w:r>
+          </w:p>
+        </w:tc>
+        <w:tc>
+          <w:tcPr>
+            <w:tcW w:type="dxa" w:w="2160"/>
+          </w:tcPr>
+          <w:p>
+            <w:r/>
+            <w:r>
+              <w:rPr>
+                <w:b w:val="0"/>
+                <w:sz w:val="18"/>
+              </w:rPr>
+            </w:r>
+          </w:p>
+        </w:tc>
+      </w:tr>
+      <w:tr>
+        <w:tc>
+          <w:tcPr>
+            <w:tcW w:type="dxa" w:w="2160"/>
+          </w:tcPr>
+          <w:p>
+            <w:r/>
+            <w:r>
+              <w:rPr>
+                <w:b w:val="0"/>
+                <w:sz w:val="18"/>
+              </w:rPr>
+              <w:t>glico_pose</w:t>
+            </w:r>
+          </w:p>
+        </w:tc>
+        <w:tc>
+          <w:tcPr>
+            <w:tcW w:type="dxa" w:w="2160"/>
+          </w:tcPr>
+          <w:p>
+            <w:r/>
+            <w:r>
+              <w:rPr>
+                <w:b w:val="0"/>
+                <w:sz w:val="18"/>
+              </w:rPr>
+              <w:t>1.00</w:t>
+            </w:r>
+          </w:p>
+        </w:tc>
+        <w:tc>
+          <w:tcPr>
+            <w:tcW w:type="dxa" w:w="2160"/>
+          </w:tcPr>
+          <w:p>
+            <w:r/>
+            <w:r>
+              <w:rPr>
+                <w:b w:val="0"/>
+                <w:sz w:val="18"/>
+              </w:rPr>
+              <w:t>1.00</w:t>
+            </w:r>
+          </w:p>
+        </w:tc>
+        <w:tc>
+          <w:tcPr>
+            <w:tcW w:type="dxa" w:w="2160"/>
+          </w:tcPr>
+          <w:p>
+            <w:r/>
+            <w:r>
+              <w:rPr>
+                <w:b w:val="0"/>
+                <w:sz w:val="18"/>
+              </w:rPr>
+            </w:r>
+          </w:p>
+        </w:tc>
+      </w:tr>
+    </w:tbl>
+    <w:p>
+      <w:r>
+        <w:t>Read: accuracy is a wash. RandomForest is chosen as the working default for two reasons — its `sit`@s02 cross-person recall is much higher (0.77 vs 0.43; that is the only honest generalisation number we have) and its confidences are calibrated (LightGBM outputs ~1.0 on almost everything, which breaks the idle/unknown threshold in Phase 5). LightGBM's one real advantage is size (36 MB vs 396 MB) — revisit if the deploy target is tight on disk. Final lock is a Phase 4 decision, after the MLP and the feature fixes.</w:t>
+      </w:r>
+    </w:p>
+    <w:p>
+      <w:pPr>
+        <w:pStyle w:val="Heading1"/>
+      </w:pPr>
+      <w:r>
+        <w:t>4. Per-class results (RandomForest)</w:t>
       </w:r>
     </w:p>
     <w:tbl>
@@ -1821,14 +3132,6 @@
     </w:tbl>
     <w:p>
       <w:r>
-        <w:rPr>
-          <w:sz w:val="18"/>
-        </w:rPr>
-        <w:t>macro-F1: all classes 0.75; real-eval only 0.64. Model comparison: lgbm 0.64, rf 0.64 — a tie.</w:t>
-      </w:r>
-    </w:p>
-    <w:p>
-      <w:r>
         <w:t>What each eval type means:</w:t>
       </w:r>
     </w:p>
@@ -1861,7 +3164,7 @@
         <w:pStyle w:val="Heading1"/>
       </w:pPr>
       <w:r>
-        <w:t>4. sit — the one clean cross-person number</w:t>
+        <w:t>5. sit — the one clean cross-person number</w:t>
       </w:r>
     </w:p>
     <w:p>
@@ -2027,7 +3330,7 @@
         <w:pStyle w:val="Heading1"/>
       </w:pPr>
       <w:r>
-        <w:t>5. The two failures</w:t>
+        <w:t>6. The two failures</w:t>
       </w:r>
     </w:p>
     <w:p>
@@ -2105,7 +3408,7 @@
         <w:pStyle w:val="Heading1"/>
       </w:pPr>
       <w:r>
-        <w:t>6. Top confusions</w:t>
+        <w:t>7. Top confusions</w:t>
       </w:r>
     </w:p>
     <w:tbl>
@@ -2642,7 +3945,7 @@
         <w:pStyle w:val="Heading1"/>
       </w:pPr>
       <w:r>
-        <w:t>7. Phase 4 plan</w:t>
+        <w:t>8. Phase 4 plan</w:t>
       </w:r>
     </w:p>
     <w:p>

</xml_diff>

<commit_message>
Phase 3: idle down-weight, report rewrite, docs
- train.py: idle weight x0.6 (it was swallowing borderline gesture frames).
- scripts/phase3_report.py rewritten for the 12-modelled-class result: real
  LGBM/RF head-to-head (incl. sit@s02 0.45 vs 0.68), per-class table, the 3
  pending classes + where their frames land, the rock hand-gap image, Phase 4
  plan. results/phase3/classifier_report.docx regenerated.
- docs/phase3_baseline.md rewritten.

Baseline: RF macro-F1 0.87 (12 classes) / 0.81 (8 real-eval) / sit@s02 0.68.
Usable; pipeline ready for Phase 4 model exploration.
</commit_message>
<xml_diff>
--- a/results/phase3/classifier_report.docx
+++ b/results/phase3/classifier_report.docx
@@ -22,15 +22,15 @@
       <w:r>
         <w:rPr>
           <w:b/>
-          <w:color w:val="B00000"/>
-          <w:sz w:val="26"/>
+          <w:color w:val="1A7F37"/>
+          <w:sz w:val="24"/>
         </w:rPr>
-        <w:t>Verdict: Phase 3 exit criterion NOT met.</w:t>
+        <w:t>Result: a usable 12-class baseline. 3 classes have no training data and are held for Phase 6.</w:t>
       </w:r>
     </w:p>
     <w:p>
       <w:r>
-        <w:t>Two tree baselines were trained independently as candidates for the single classifier slot (section 3). On accuracy they tie — macro-F1 0.64 on the real-generalisation classes. Most classes work, but `rock` and `mini_heart` are at 0.00 F1 — every test frame of each is classified as a different class. Those two failures are data/feature problems, not model-choice problems, and define the Phase 4 work.</w:t>
+        <w:t>macro-F1 over the 12 modelled classes: lgbm 0.88 / rf 0.87.  Over just the 8 that are a real generalisation test (external train, our test): lgbm 0.83 / rf 0.81. Every modelled class scores &gt;= 0.6. `i_love_you`, `heart`, `mini_heart` are NOT modelled — no public dataset has the ASL ILY handshape or the overhead 2-arm heart, and HaGRID's hand-heart is a chest-level finger-heart that does not transfer to s01's overhead one. Training them on augmented s01 frames actively hurt the model (it dragged `rock` to 0.00), so they are excluded until Phase 6 field data.</w:t>
       </w:r>
     </w:p>
     <w:p>
@@ -43,12 +43,12 @@
     </w:p>
     <w:p>
       <w:r>
-        <w:t>The pipeline has exactly ONE classifier slot: 152-d fused feature vector in -&gt; (class, confidence) out -&gt; temporal smoothing -&gt; final label or idle. Phase 3 trains candidate models for that slot; it does not stack or ensemble them. LightGBM and RandomForest are two candidates. Phase 4 adds an MLP and picks one to lock (ARCHITECTURE.md 'Classifier interface').</w:t>
+        <w:t>The pipeline has exactly ONE classifier slot: fused feature vector in -&gt; (class, confidence) out -&gt; temporal smoothing -&gt; final label or idle. Phase 3 trains candidate models for that slot; it does NOT stack or ensemble them. LightGBM and RandomForest are the two Phase 3 candidates; Phase 4 adds an MLP and locks one (ARCHITECTURE.md 'Classifier interface').</w:t>
       </w:r>
     </w:p>
     <w:p>
       <w:r>
-        <w:t>LightGBM = gradient-boosted shallow trees (each corrects the last). RandomForest = many independent deep trees, averaged. Both on the raw 152-d vector, class_weight='balanced', features clipped to +-10.</w:t>
+        <w:t>Features: both — the 152-d raw normalised keypoints PLUS 36 derived features (joint angles + a few length ratios, features/derived.py). The derived features are scale-invariant, which matters because MediaPipe Hands on a tight robot-camera wrist-crop produces a differently proportioned skeleton than on a large webcam hand (this broke `rock` in the first pass). class_weight = balanced x {aug-only 0.35, idle 0.6}. Features clipped to +-10.</w:t>
       </w:r>
     </w:p>
     <w:p>
@@ -61,12 +61,12 @@
     </w:p>
     <w:p>
       <w:r>
-        <w:t>Train: 62,627 rows — cleaned external features (HaGRID, COCO) + augmentation, for 8 classes; the other 6 (sit, squat, laying, i_love_you, heart, glico_pose) are augmented copies of s01 frames (no external source). See docs/phase2b_external_data.md.</w:t>
+        <w:t>Train: 51,103 rows — cleaned external features (HaGRID, COCO) + augmentation for the cross-domain classes; augmented s01 frames for sit/squat/laying/glico_pose. Pending classes contribute 0 rows. See results/phase2/dataset_report.docx.</w:t>
       </w:r>
     </w:p>
     <w:p>
       <w:r>
-        <w:t>Test: 1,581 rows, never augmented — every original s01/s02 frame (1,367) + 214 held-out HaGRID `thumb` frames. s01/s02 are NOT in training (except as augmented copies for the 6 aug-only classes).</w:t>
+        <w:t>Test: 1,581 rows, NEVER augmented — every original s01/s02 frame (1,367) + 214 held-out HaGRID `thumb`. Metrics below are computed only over the 12 modelled classes' frames; the pending-class frames are reported separately (section 6).</w:t>
       </w:r>
     </w:p>
     <w:p>
@@ -74,12 +74,7 @@
         <w:pStyle w:val="Heading1"/>
       </w:pPr>
       <w:r>
-        <w:t>3. LightGBM vs RandomForest — the head-to-head</w:t>
-      </w:r>
-    </w:p>
-    <w:p>
-      <w:r>
-        <w:t>Both trained on the same 62,627-row train.npz, class_weight='balanced', raw 152-d features clipped to +-10. This is the Phase 3 comparison; Phase 4 adds an MLP and locks one.</w:t>
+        <w:t>3. LightGBM vs RandomForest</w:t>
       </w:r>
     </w:p>
     <w:tbl>
@@ -152,7 +147,7 @@
                 <w:b w:val="0"/>
                 <w:sz w:val="18"/>
               </w:rPr>
-              <w:t>macro-F1 (all classes)</w:t>
+              <w:t>macro-F1 (modelled classes)</w:t>
             </w:r>
           </w:p>
         </w:tc>
@@ -167,7 +162,7 @@
                 <w:b w:val="0"/>
                 <w:sz w:val="18"/>
               </w:rPr>
-              <w:t>0.745</w:t>
+              <w:t>0.882</w:t>
             </w:r>
           </w:p>
         </w:tc>
@@ -182,7 +177,7 @@
                 <w:b w:val="0"/>
                 <w:sz w:val="18"/>
               </w:rPr>
-              <w:t>0.748</w:t>
+              <w:t>0.873</w:t>
             </w:r>
           </w:p>
         </w:tc>
@@ -214,7 +209,7 @@
                 <w:b w:val="0"/>
                 <w:sz w:val="18"/>
               </w:rPr>
-              <w:t>0.637</w:t>
+              <w:t>0.828</w:t>
             </w:r>
           </w:p>
         </w:tc>
@@ -229,7 +224,7 @@
                 <w:b w:val="0"/>
                 <w:sz w:val="18"/>
               </w:rPr>
-              <w:t>0.639</w:t>
+              <w:t>0.813</w:t>
             </w:r>
           </w:p>
         </w:tc>
@@ -261,7 +256,7 @@
                 <w:b w:val="0"/>
                 <w:sz w:val="18"/>
               </w:rPr>
-              <w:t>0.43</w:t>
+              <w:t>0.45</w:t>
             </w:r>
           </w:p>
         </w:tc>
@@ -276,7 +271,7 @@
                 <w:b w:val="0"/>
                 <w:sz w:val="18"/>
               </w:rPr>
-              <w:t>0.77</w:t>
+              <w:t>0.68</w:t>
             </w:r>
           </w:p>
         </w:tc>
@@ -308,7 +303,7 @@
                 <w:b w:val="0"/>
                 <w:sz w:val="18"/>
               </w:rPr>
-              <w:t>118.0 s</w:t>
+              <w:t>120.2 s</w:t>
             </w:r>
           </w:p>
         </w:tc>
@@ -323,7 +318,7 @@
                 <w:b w:val="0"/>
                 <w:sz w:val="18"/>
               </w:rPr>
-              <w:t>56.0 s</w:t>
+              <w:t>125.2 s</w:t>
             </w:r>
           </w:p>
         </w:tc>
@@ -355,7 +350,7 @@
                 <w:b w:val="0"/>
                 <w:sz w:val="18"/>
               </w:rPr>
-              <w:t>36.2 MB</w:t>
+              <w:t>29.9 MB</w:t>
             </w:r>
           </w:p>
         </w:tc>
@@ -370,17 +365,12 @@
                 <w:b w:val="0"/>
                 <w:sz w:val="18"/>
               </w:rPr>
-              <w:t>396.3 MB</w:t>
+              <w:t>305.5 MB</w:t>
             </w:r>
           </w:p>
         </w:tc>
       </w:tr>
     </w:tbl>
-    <w:p>
-      <w:r>
-        <w:t>Per-class F1 (bold = the two differ by &gt; 0.05):</w:t>
-      </w:r>
-    </w:p>
     <w:tbl>
       <w:tblPr>
         <w:tblStyle w:val="LightGrid-Accent1"/>
@@ -450,6 +440,7 @@
                 <w:b/>
                 <w:sz w:val="18"/>
               </w:rPr>
+              <w:t>differ</w:t>
             </w:r>
           </w:p>
         </w:tc>
@@ -483,7 +474,7 @@
                 <w:color w:val="886600"/>
                 <w:sz w:val="18"/>
               </w:rPr>
-              <w:t>0.59</w:t>
+              <w:t>0.56</w:t>
             </w:r>
           </w:p>
         </w:tc>
@@ -499,7 +490,7 @@
                 <w:color w:val="886600"/>
                 <w:sz w:val="18"/>
               </w:rPr>
-              <w:t>0.65</w:t>
+              <w:t>0.64</w:t>
             </w:r>
           </w:p>
         </w:tc>
@@ -562,7 +553,7 @@
                 <w:b w:val="0"/>
                 <w:sz w:val="18"/>
               </w:rPr>
-              <w:t>0.81</w:t>
+              <w:t>0.82</w:t>
             </w:r>
           </w:p>
         </w:tc>
@@ -684,7 +675,7 @@
                 <w:b w:val="0"/>
                 <w:sz w:val="18"/>
               </w:rPr>
-              <w:t>0.98</w:t>
+              <w:t>0.97</w:t>
             </w:r>
           </w:p>
         </w:tc>
@@ -852,7 +843,7 @@
                 <w:b w:val="0"/>
                 <w:sz w:val="18"/>
               </w:rPr>
-              <w:t>0.77</w:t>
+              <w:t>0.78</w:t>
             </w:r>
           </w:p>
         </w:tc>
@@ -867,7 +858,7 @@
                 <w:b w:val="0"/>
                 <w:sz w:val="18"/>
               </w:rPr>
-              <w:t>0.77</w:t>
+              <w:t>0.78</w:t>
             </w:r>
           </w:p>
         </w:tc>
@@ -896,67 +887,7 @@
             <w:r>
               <w:rPr>
                 <w:b w:val="0"/>
-                <w:sz w:val="18"/>
-              </w:rPr>
-              <w:t>i_love_you</w:t>
-            </w:r>
-          </w:p>
-        </w:tc>
-        <w:tc>
-          <w:tcPr>
-            <w:tcW w:type="dxa" w:w="2160"/>
-          </w:tcPr>
-          <w:p>
-            <w:r/>
-            <w:r>
-              <w:rPr>
-                <w:b w:val="0"/>
-                <w:sz w:val="18"/>
-              </w:rPr>
-              <w:t>0.68</w:t>
-            </w:r>
-          </w:p>
-        </w:tc>
-        <w:tc>
-          <w:tcPr>
-            <w:tcW w:type="dxa" w:w="2160"/>
-          </w:tcPr>
-          <w:p>
-            <w:r/>
-            <w:r>
-              <w:rPr>
-                <w:b w:val="0"/>
-                <w:sz w:val="18"/>
-              </w:rPr>
-              <w:t>0.69</w:t>
-            </w:r>
-          </w:p>
-        </w:tc>
-        <w:tc>
-          <w:tcPr>
-            <w:tcW w:type="dxa" w:w="2160"/>
-          </w:tcPr>
-          <w:p>
-            <w:r/>
-            <w:r>
-              <w:rPr>
-                <w:b w:val="0"/>
-                <w:sz w:val="18"/>
-              </w:rPr>
-            </w:r>
-          </w:p>
-        </w:tc>
-      </w:tr>
-      <w:tr>
-        <w:tc>
-          <w:tcPr>
-            <w:tcW w:type="dxa" w:w="2160"/>
-          </w:tcPr>
-          <w:p>
-            <w:r/>
-            <w:r>
-              <w:rPr>
-                <w:b w:val="0"/>
+                <w:color w:val="886600"/>
                 <w:sz w:val="18"/>
               </w:rPr>
               <w:t>rock</w:t>
@@ -972,9 +903,10 @@
             <w:r>
               <w:rPr>
                 <w:b w:val="0"/>
+                <w:color w:val="886600"/>
                 <w:sz w:val="18"/>
               </w:rPr>
-              <w:t>0.00</w:t>
+              <w:t>0.86</w:t>
             </w:r>
           </w:p>
         </w:tc>
@@ -987,9 +919,10 @@
             <w:r>
               <w:rPr>
                 <w:b w:val="0"/>
+                <w:color w:val="886600"/>
                 <w:sz w:val="18"/>
               </w:rPr>
-              <w:t>0.00</w:t>
+              <w:t>0.78</w:t>
             </w:r>
           </w:p>
         </w:tc>
@@ -1002,8 +935,10 @@
             <w:r>
               <w:rPr>
                 <w:b w:val="0"/>
+                <w:color w:val="886600"/>
                 <w:sz w:val="18"/>
               </w:rPr>
+              <w:t>*</w:t>
             </w:r>
           </w:p>
         </w:tc>
@@ -1018,6 +953,7 @@
             <w:r>
               <w:rPr>
                 <w:b w:val="0"/>
+                <w:color w:val="886600"/>
                 <w:sz w:val="18"/>
               </w:rPr>
               <w:t>two_finger</w:t>
@@ -1033,9 +969,10 @@
             <w:r>
               <w:rPr>
                 <w:b w:val="0"/>
+                <w:color w:val="886600"/>
                 <w:sz w:val="18"/>
               </w:rPr>
-              <w:t>0.83</w:t>
+              <w:t>0.84</w:t>
             </w:r>
           </w:p>
         </w:tc>
@@ -1048,9 +985,10 @@
             <w:r>
               <w:rPr>
                 <w:b w:val="0"/>
+                <w:color w:val="886600"/>
                 <w:sz w:val="18"/>
               </w:rPr>
-              <w:t>0.81</w:t>
+              <w:t>0.74</w:t>
             </w:r>
           </w:p>
         </w:tc>
@@ -1063,8 +1001,10 @@
             <w:r>
               <w:rPr>
                 <w:b w:val="0"/>
+                <w:color w:val="886600"/>
                 <w:sz w:val="18"/>
               </w:rPr>
+              <w:t>*</w:t>
             </w:r>
           </w:p>
         </w:tc>
@@ -1096,7 +1036,7 @@
                 <w:b w:val="0"/>
                 <w:sz w:val="18"/>
               </w:rPr>
-              <w:t>0.98</w:t>
+              <w:t>0.99</w:t>
             </w:r>
           </w:p>
         </w:tc>
@@ -1142,128 +1082,6 @@
                 <w:b w:val="0"/>
                 <w:sz w:val="18"/>
               </w:rPr>
-              <w:t>heart</w:t>
-            </w:r>
-          </w:p>
-        </w:tc>
-        <w:tc>
-          <w:tcPr>
-            <w:tcW w:type="dxa" w:w="2160"/>
-          </w:tcPr>
-          <w:p>
-            <w:r/>
-            <w:r>
-              <w:rPr>
-                <w:b w:val="0"/>
-                <w:sz w:val="18"/>
-              </w:rPr>
-              <w:t>0.81</w:t>
-            </w:r>
-          </w:p>
-        </w:tc>
-        <w:tc>
-          <w:tcPr>
-            <w:tcW w:type="dxa" w:w="2160"/>
-          </w:tcPr>
-          <w:p>
-            <w:r/>
-            <w:r>
-              <w:rPr>
-                <w:b w:val="0"/>
-                <w:sz w:val="18"/>
-              </w:rPr>
-              <w:t>0.81</w:t>
-            </w:r>
-          </w:p>
-        </w:tc>
-        <w:tc>
-          <w:tcPr>
-            <w:tcW w:type="dxa" w:w="2160"/>
-          </w:tcPr>
-          <w:p>
-            <w:r/>
-            <w:r>
-              <w:rPr>
-                <w:b w:val="0"/>
-                <w:sz w:val="18"/>
-              </w:rPr>
-            </w:r>
-          </w:p>
-        </w:tc>
-      </w:tr>
-      <w:tr>
-        <w:tc>
-          <w:tcPr>
-            <w:tcW w:type="dxa" w:w="2160"/>
-          </w:tcPr>
-          <w:p>
-            <w:r/>
-            <w:r>
-              <w:rPr>
-                <w:b w:val="0"/>
-                <w:sz w:val="18"/>
-              </w:rPr>
-              <w:t>mini_heart</w:t>
-            </w:r>
-          </w:p>
-        </w:tc>
-        <w:tc>
-          <w:tcPr>
-            <w:tcW w:type="dxa" w:w="2160"/>
-          </w:tcPr>
-          <w:p>
-            <w:r/>
-            <w:r>
-              <w:rPr>
-                <w:b w:val="0"/>
-                <w:sz w:val="18"/>
-              </w:rPr>
-              <w:t>0.00</w:t>
-            </w:r>
-          </w:p>
-        </w:tc>
-        <w:tc>
-          <w:tcPr>
-            <w:tcW w:type="dxa" w:w="2160"/>
-          </w:tcPr>
-          <w:p>
-            <w:r/>
-            <w:r>
-              <w:rPr>
-                <w:b w:val="0"/>
-                <w:sz w:val="18"/>
-              </w:rPr>
-              <w:t>0.00</w:t>
-            </w:r>
-          </w:p>
-        </w:tc>
-        <w:tc>
-          <w:tcPr>
-            <w:tcW w:type="dxa" w:w="2160"/>
-          </w:tcPr>
-          <w:p>
-            <w:r/>
-            <w:r>
-              <w:rPr>
-                <w:b w:val="0"/>
-                <w:sz w:val="18"/>
-              </w:rPr>
-            </w:r>
-          </w:p>
-        </w:tc>
-      </w:tr>
-      <w:tr>
-        <w:tc>
-          <w:tcPr>
-            <w:tcW w:type="dxa" w:w="2160"/>
-          </w:tcPr>
-          <w:p>
-            <w:r/>
-            <w:r>
-              <w:rPr>
-                <w:b w:val="0"/>
-                <w:sz w:val="18"/>
-              </w:rPr>
               <w:t>t_pose</w:t>
             </w:r>
           </w:p>
@@ -1279,7 +1097,7 @@
                 <w:b w:val="0"/>
                 <w:sz w:val="18"/>
               </w:rPr>
-              <w:t>0.84</w:t>
+              <w:t>0.86</w:t>
             </w:r>
           </w:p>
         </w:tc>
@@ -1294,7 +1112,7 @@
                 <w:b w:val="0"/>
                 <w:sz w:val="18"/>
               </w:rPr>
-              <w:t>0.84</w:t>
+              <w:t>0.88</w:t>
             </w:r>
           </w:p>
         </w:tc>
@@ -1377,7 +1195,7 @@
     </w:tbl>
     <w:p>
       <w:r>
-        <w:t>Read: accuracy is a wash. RandomForest is chosen as the working default for two reasons — its `sit`@s02 cross-person recall is much higher (0.77 vs 0.43; that is the only honest generalisation number we have) and its confidences are calibrated (LightGBM outputs ~1.0 on almost everything, which breaks the idle/unknown threshold in Phase 5). LightGBM's one real advantage is size (36 MB vs 396 MB) — revisit if the deploy target is tight on disk. Final lock is a Phase 4 decision, after the MLP and the feature fixes.</w:t>
+        <w:t>Accuracy is close. RandomForest is the working default: its `sit`@s02 recall (0.68 vs 0.45) is the only honest cross-person number we have, and its confidences are spread (LightGBM outputs ~1.0 on almost everything, which would break the idle/unknown threshold in Phase 5). LightGBM is 11x smaller. Final lock is Phase 4.</w:t>
       </w:r>
     </w:p>
     <w:p>
@@ -1520,6 +1338,7 @@
             <w:r>
               <w:rPr>
                 <w:b w:val="0"/>
+                <w:color w:val="886600"/>
                 <w:sz w:val="18"/>
               </w:rPr>
               <w:t>idle</w:t>
@@ -1535,6 +1354,7 @@
             <w:r>
               <w:rPr>
                 <w:b w:val="0"/>
+                <w:color w:val="886600"/>
                 <w:sz w:val="18"/>
               </w:rPr>
               <w:t>cross_domain</w:t>
@@ -1550,6 +1370,7 @@
             <w:r>
               <w:rPr>
                 <w:b w:val="0"/>
+                <w:color w:val="886600"/>
                 <w:sz w:val="18"/>
               </w:rPr>
               <w:t>60</w:t>
@@ -1565,9 +1386,10 @@
             <w:r>
               <w:rPr>
                 <w:b w:val="0"/>
+                <w:color w:val="886600"/>
                 <w:sz w:val="18"/>
               </w:rPr>
-              <w:t>0.48</w:t>
+              <w:t>0.47</w:t>
             </w:r>
           </w:p>
         </w:tc>
@@ -1580,6 +1402,7 @@
             <w:r>
               <w:rPr>
                 <w:b w:val="0"/>
+                <w:color w:val="886600"/>
                 <w:sz w:val="18"/>
               </w:rPr>
               <w:t>1.00</w:t>
@@ -1595,9 +1418,10 @@
             <w:r>
               <w:rPr>
                 <w:b w:val="0"/>
+                <w:color w:val="886600"/>
                 <w:sz w:val="18"/>
               </w:rPr>
-              <w:t>0.65</w:t>
+              <w:t>0.64</w:t>
             </w:r>
           </w:p>
         </w:tc>
@@ -1610,9 +1434,10 @@
             <w:r>
               <w:rPr>
                 <w:b w:val="0"/>
+                <w:color w:val="886600"/>
                 <w:sz w:val="18"/>
               </w:rPr>
-              <w:t>0.72</w:t>
+              <w:t>0.76</w:t>
             </w:r>
           </w:p>
         </w:tc>
@@ -1689,7 +1514,7 @@
                 <w:b w:val="0"/>
                 <w:sz w:val="18"/>
               </w:rPr>
-              <w:t>0.69</w:t>
+              <w:t>0.70</w:t>
             </w:r>
           </w:p>
         </w:tc>
@@ -1704,7 +1529,7 @@
                 <w:b w:val="0"/>
                 <w:sz w:val="18"/>
               </w:rPr>
-              <w:t>0.81</w:t>
+              <w:t>0.82</w:t>
             </w:r>
           </w:p>
         </w:tc>
@@ -1719,7 +1544,7 @@
                 <w:b w:val="0"/>
                 <w:sz w:val="18"/>
               </w:rPr>
-              <w:t>0.71</w:t>
+              <w:t>0.77</w:t>
             </w:r>
           </w:p>
         </w:tc>
@@ -1826,7 +1651,7 @@
                 <w:b w:val="0"/>
                 <w:sz w:val="18"/>
               </w:rPr>
-              <w:t>0.67</w:t>
+              <w:t>0.76</w:t>
             </w:r>
           </w:p>
         </w:tc>
@@ -1903,7 +1728,7 @@
                 <w:b w:val="0"/>
                 <w:sz w:val="18"/>
               </w:rPr>
-              <w:t>0.96</w:t>
+              <w:t>0.95</w:t>
             </w:r>
           </w:p>
         </w:tc>
@@ -1918,7 +1743,7 @@
                 <w:b w:val="0"/>
                 <w:sz w:val="18"/>
               </w:rPr>
-              <w:t>0.98</w:t>
+              <w:t>0.97</w:t>
             </w:r>
           </w:p>
         </w:tc>
@@ -2209,7 +2034,7 @@
                 <w:b w:val="0"/>
                 <w:sz w:val="18"/>
               </w:rPr>
-              <w:t>0.97</w:t>
+              <w:t>1.00</w:t>
             </w:r>
           </w:p>
         </w:tc>
@@ -2239,7 +2064,7 @@
                 <w:b w:val="0"/>
                 <w:sz w:val="18"/>
               </w:rPr>
-              <w:t>0.77</w:t>
+              <w:t>0.78</w:t>
             </w:r>
           </w:p>
         </w:tc>
@@ -2254,7 +2079,7 @@
                 <w:b w:val="0"/>
                 <w:sz w:val="18"/>
               </w:rPr>
-              <w:t>0.80</w:t>
+              <w:t>0.86</w:t>
             </w:r>
           </w:p>
         </w:tc>
@@ -2271,114 +2096,6 @@
                 <w:b w:val="0"/>
                 <w:sz w:val="18"/>
               </w:rPr>
-              <w:t>i_love_you</w:t>
-            </w:r>
-          </w:p>
-        </w:tc>
-        <w:tc>
-          <w:tcPr>
-            <w:tcW w:type="dxa" w:w="1234"/>
-          </w:tcPr>
-          <w:p>
-            <w:r/>
-            <w:r>
-              <w:rPr>
-                <w:b w:val="0"/>
-                <w:sz w:val="18"/>
-              </w:rPr>
-              <w:t>aug_only_leak</w:t>
-            </w:r>
-          </w:p>
-        </w:tc>
-        <w:tc>
-          <w:tcPr>
-            <w:tcW w:type="dxa" w:w="1234"/>
-          </w:tcPr>
-          <w:p>
-            <w:r/>
-            <w:r>
-              <w:rPr>
-                <w:b w:val="0"/>
-                <w:sz w:val="18"/>
-              </w:rPr>
-              <w:t>141</w:t>
-            </w:r>
-          </w:p>
-        </w:tc>
-        <w:tc>
-          <w:tcPr>
-            <w:tcW w:type="dxa" w:w="1234"/>
-          </w:tcPr>
-          <w:p>
-            <w:r/>
-            <w:r>
-              <w:rPr>
-                <w:b w:val="0"/>
-                <w:sz w:val="18"/>
-              </w:rPr>
-              <w:t>0.53</w:t>
-            </w:r>
-          </w:p>
-        </w:tc>
-        <w:tc>
-          <w:tcPr>
-            <w:tcW w:type="dxa" w:w="1234"/>
-          </w:tcPr>
-          <w:p>
-            <w:r/>
-            <w:r>
-              <w:rPr>
-                <w:b w:val="0"/>
-                <w:sz w:val="18"/>
-              </w:rPr>
-              <w:t>1.00</w:t>
-            </w:r>
-          </w:p>
-        </w:tc>
-        <w:tc>
-          <w:tcPr>
-            <w:tcW w:type="dxa" w:w="1234"/>
-          </w:tcPr>
-          <w:p>
-            <w:r/>
-            <w:r>
-              <w:rPr>
-                <w:b w:val="0"/>
-                <w:sz w:val="18"/>
-              </w:rPr>
-              <w:t>0.69</w:t>
-            </w:r>
-          </w:p>
-        </w:tc>
-        <w:tc>
-          <w:tcPr>
-            <w:tcW w:type="dxa" w:w="1234"/>
-          </w:tcPr>
-          <w:p>
-            <w:r/>
-            <w:r>
-              <w:rPr>
-                <w:b w:val="0"/>
-                <w:sz w:val="18"/>
-              </w:rPr>
-              <w:t>1.00</w:t>
-            </w:r>
-          </w:p>
-        </w:tc>
-      </w:tr>
-      <w:tr>
-        <w:tc>
-          <w:tcPr>
-            <w:tcW w:type="dxa" w:w="1234"/>
-          </w:tcPr>
-          <w:p>
-            <w:r/>
-            <w:r>
-              <w:rPr>
-                <w:b w:val="0"/>
-                <w:color w:val="B00000"/>
-                <w:sz w:val="18"/>
-              </w:rPr>
               <w:t>rock</w:t>
             </w:r>
           </w:p>
@@ -2392,7 +2109,6 @@
             <w:r>
               <w:rPr>
                 <w:b w:val="0"/>
-                <w:color w:val="B00000"/>
                 <w:sz w:val="18"/>
               </w:rPr>
               <w:t>cross_domain</w:t>
@@ -2408,7 +2124,6 @@
             <w:r>
               <w:rPr>
                 <w:b w:val="0"/>
-                <w:color w:val="B00000"/>
                 <w:sz w:val="18"/>
               </w:rPr>
               <w:t>102</w:t>
@@ -2424,10 +2139,9 @@
             <w:r>
               <w:rPr>
                 <w:b w:val="0"/>
-                <w:color w:val="B00000"/>
                 <w:sz w:val="18"/>
               </w:rPr>
-              <w:t>0.00</w:t>
+              <w:t>0.76</w:t>
             </w:r>
           </w:p>
         </w:tc>
@@ -2440,10 +2154,9 @@
             <w:r>
               <w:rPr>
                 <w:b w:val="0"/>
-                <w:color w:val="B00000"/>
                 <w:sz w:val="18"/>
               </w:rPr>
-              <w:t>0.00</w:t>
+              <w:t>0.81</w:t>
             </w:r>
           </w:p>
         </w:tc>
@@ -2456,10 +2169,9 @@
             <w:r>
               <w:rPr>
                 <w:b w:val="0"/>
-                <w:color w:val="B00000"/>
                 <w:sz w:val="18"/>
               </w:rPr>
-              <w:t>0.00</w:t>
+              <w:t>0.78</w:t>
             </w:r>
           </w:p>
         </w:tc>
@@ -2472,10 +2184,9 @@
             <w:r>
               <w:rPr>
                 <w:b w:val="0"/>
-                <w:color w:val="B00000"/>
                 <w:sz w:val="18"/>
               </w:rPr>
-              <w:t>0.80</w:t>
+              <w:t>0.48</w:t>
             </w:r>
           </w:p>
         </w:tc>
@@ -2537,7 +2248,7 @@
                 <w:b w:val="0"/>
                 <w:sz w:val="18"/>
               </w:rPr>
-              <w:t>0.89</w:t>
+              <w:t>0.75</w:t>
             </w:r>
           </w:p>
         </w:tc>
@@ -2567,7 +2278,7 @@
                 <w:b w:val="0"/>
                 <w:sz w:val="18"/>
               </w:rPr>
-              <w:t>0.81</w:t>
+              <w:t>0.74</w:t>
             </w:r>
           </w:p>
         </w:tc>
@@ -2582,7 +2293,7 @@
                 <w:b w:val="0"/>
                 <w:sz w:val="18"/>
               </w:rPr>
-              <w:t>0.91</w:t>
+              <w:t>0.89</w:t>
             </w:r>
           </w:p>
         </w:tc>
@@ -2644,7 +2355,7 @@
                 <w:b w:val="0"/>
                 <w:sz w:val="18"/>
               </w:rPr>
-              <w:t>0.99</w:t>
+              <w:t>0.98</w:t>
             </w:r>
           </w:p>
         </w:tc>
@@ -2689,228 +2400,7 @@
                 <w:b w:val="0"/>
                 <w:sz w:val="18"/>
               </w:rPr>
-              <w:t>0.89</w:t>
-            </w:r>
-          </w:p>
-        </w:tc>
-      </w:tr>
-      <w:tr>
-        <w:tc>
-          <w:tcPr>
-            <w:tcW w:type="dxa" w:w="1234"/>
-          </w:tcPr>
-          <w:p>
-            <w:r/>
-            <w:r>
-              <w:rPr>
-                <w:b w:val="0"/>
-                <w:sz w:val="18"/>
-              </w:rPr>
-              <w:t>heart</w:t>
-            </w:r>
-          </w:p>
-        </w:tc>
-        <w:tc>
-          <w:tcPr>
-            <w:tcW w:type="dxa" w:w="1234"/>
-          </w:tcPr>
-          <w:p>
-            <w:r/>
-            <w:r>
-              <w:rPr>
-                <w:b w:val="0"/>
-                <w:sz w:val="18"/>
-              </w:rPr>
-              <w:t>aug_only_leak</w:t>
-            </w:r>
-          </w:p>
-        </w:tc>
-        <w:tc>
-          <w:tcPr>
-            <w:tcW w:type="dxa" w:w="1234"/>
-          </w:tcPr>
-          <w:p>
-            <w:r/>
-            <w:r>
-              <w:rPr>
-                <w:b w:val="0"/>
-                <w:sz w:val="18"/>
-              </w:rPr>
-              <w:t>84</w:t>
-            </w:r>
-          </w:p>
-        </w:tc>
-        <w:tc>
-          <w:tcPr>
-            <w:tcW w:type="dxa" w:w="1234"/>
-          </w:tcPr>
-          <w:p>
-            <w:r/>
-            <w:r>
-              <w:rPr>
-                <w:b w:val="0"/>
-                <w:sz w:val="18"/>
-              </w:rPr>
-              <w:t>0.68</w:t>
-            </w:r>
-          </w:p>
-        </w:tc>
-        <w:tc>
-          <w:tcPr>
-            <w:tcW w:type="dxa" w:w="1234"/>
-          </w:tcPr>
-          <w:p>
-            <w:r/>
-            <w:r>
-              <w:rPr>
-                <w:b w:val="0"/>
-                <w:sz w:val="18"/>
-              </w:rPr>
-              <w:t>1.00</w:t>
-            </w:r>
-          </w:p>
-        </w:tc>
-        <w:tc>
-          <w:tcPr>
-            <w:tcW w:type="dxa" w:w="1234"/>
-          </w:tcPr>
-          <w:p>
-            <w:r/>
-            <w:r>
-              <w:rPr>
-                <w:b w:val="0"/>
-                <w:sz w:val="18"/>
-              </w:rPr>
-              <w:t>0.81</w:t>
-            </w:r>
-          </w:p>
-        </w:tc>
-        <w:tc>
-          <w:tcPr>
-            <w:tcW w:type="dxa" w:w="1234"/>
-          </w:tcPr>
-          <w:p>
-            <w:r/>
-            <w:r>
-              <w:rPr>
-                <w:b w:val="0"/>
-                <w:sz w:val="18"/>
-              </w:rPr>
-              <w:t>0.98</w:t>
-            </w:r>
-          </w:p>
-        </w:tc>
-      </w:tr>
-      <w:tr>
-        <w:tc>
-          <w:tcPr>
-            <w:tcW w:type="dxa" w:w="1234"/>
-          </w:tcPr>
-          <w:p>
-            <w:r/>
-            <w:r>
-              <w:rPr>
-                <w:b w:val="0"/>
-                <w:color w:val="B00000"/>
-                <w:sz w:val="18"/>
-              </w:rPr>
-              <w:t>mini_heart</w:t>
-            </w:r>
-          </w:p>
-        </w:tc>
-        <w:tc>
-          <w:tcPr>
-            <w:tcW w:type="dxa" w:w="1234"/>
-          </w:tcPr>
-          <w:p>
-            <w:r/>
-            <w:r>
-              <w:rPr>
-                <w:b w:val="0"/>
-                <w:color w:val="B00000"/>
-                <w:sz w:val="18"/>
-              </w:rPr>
-              <w:t>cross_domain</w:t>
-            </w:r>
-          </w:p>
-        </w:tc>
-        <w:tc>
-          <w:tcPr>
-            <w:tcW w:type="dxa" w:w="1234"/>
-          </w:tcPr>
-          <w:p>
-            <w:r/>
-            <w:r>
-              <w:rPr>
-                <w:b w:val="0"/>
-                <w:color w:val="B00000"/>
-                <w:sz w:val="18"/>
-              </w:rPr>
-              <w:t>45</w:t>
-            </w:r>
-          </w:p>
-        </w:tc>
-        <w:tc>
-          <w:tcPr>
-            <w:tcW w:type="dxa" w:w="1234"/>
-          </w:tcPr>
-          <w:p>
-            <w:r/>
-            <w:r>
-              <w:rPr>
-                <w:b w:val="0"/>
-                <w:color w:val="B00000"/>
-                <w:sz w:val="18"/>
-              </w:rPr>
-              <w:t>0.00</w:t>
-            </w:r>
-          </w:p>
-        </w:tc>
-        <w:tc>
-          <w:tcPr>
-            <w:tcW w:type="dxa" w:w="1234"/>
-          </w:tcPr>
-          <w:p>
-            <w:r/>
-            <w:r>
-              <w:rPr>
-                <w:b w:val="0"/>
-                <w:color w:val="B00000"/>
-                <w:sz w:val="18"/>
-              </w:rPr>
-              <w:t>0.00</w:t>
-            </w:r>
-          </w:p>
-        </w:tc>
-        <w:tc>
-          <w:tcPr>
-            <w:tcW w:type="dxa" w:w="1234"/>
-          </w:tcPr>
-          <w:p>
-            <w:r/>
-            <w:r>
-              <w:rPr>
-                <w:b w:val="0"/>
-                <w:color w:val="B00000"/>
-                <w:sz w:val="18"/>
-              </w:rPr>
-              <w:t>0.00</w:t>
-            </w:r>
-          </w:p>
-        </w:tc>
-        <w:tc>
-          <w:tcPr>
-            <w:tcW w:type="dxa" w:w="1234"/>
-          </w:tcPr>
-          <w:p>
-            <w:r/>
-            <w:r>
-              <w:rPr>
-                <w:b w:val="0"/>
-                <w:color w:val="B00000"/>
-                <w:sz w:val="18"/>
-              </w:rPr>
-              <w:t>0.87</w:t>
+              <w:t>0.90</w:t>
             </w:r>
           </w:p>
         </w:tc>
@@ -2987,7 +2477,7 @@
                 <w:b w:val="0"/>
                 <w:sz w:val="18"/>
               </w:rPr>
-              <w:t>0.72</w:t>
+              <w:t>0.78</w:t>
             </w:r>
           </w:p>
         </w:tc>
@@ -3002,7 +2492,7 @@
                 <w:b w:val="0"/>
                 <w:sz w:val="18"/>
               </w:rPr>
-              <w:t>0.84</w:t>
+              <w:t>0.88</w:t>
             </w:r>
           </w:p>
         </w:tc>
@@ -3131,16 +2621,11 @@
       </w:tr>
     </w:tbl>
     <w:p>
-      <w:r>
-        <w:t>What each eval type means:</w:t>
-      </w:r>
-    </w:p>
-    <w:p>
       <w:pPr>
         <w:pStyle w:val="ListBullet"/>
       </w:pPr>
       <w:r>
-        <w:t>cross_domain: external train, s01/s02 test — a real generalisation number</w:t>
+        <w:t>cross_domain: external train, s01/s02 test — a real cross-subject + cross-domain number</w:t>
       </w:r>
     </w:p>
     <w:p>
@@ -3156,7 +2641,15 @@
         <w:pStyle w:val="ListBullet"/>
       </w:pPr>
       <w:r>
-        <w:t>aug_only_leak: train = augmented s01 frames — NOT a generalisation number</w:t>
+        <w:t>aug_only_leak: train = augmented s01 frames — a leaked number (except sit@s02)</w:t>
+      </w:r>
+    </w:p>
+    <w:p>
+      <w:pPr>
+        <w:pStyle w:val="ListBullet"/>
+      </w:pPr>
+      <w:r>
+        <w:t>pending_data: no viable training path — not modelled, see section 6</w:t>
       </w:r>
     </w:p>
     <w:p>
@@ -3169,7 +2662,7 @@
     </w:p>
     <w:p>
       <w:r>
-        <w:t>`sit` is trained on augmented s01 frames only, so its s02 test frames (a different person, different session, different room) are a genuine cross-person check:</w:t>
+        <w:t>`sit` trains on augmented s01 frames only, so its s02 test frames (different person, session, room) are a genuine cross-person check.</w:t>
       </w:r>
     </w:p>
     <w:tbl>
@@ -3210,7 +2703,7 @@
                 <w:b/>
                 <w:sz w:val="18"/>
               </w:rPr>
-              <w:t>recall</w:t>
+              <w:t>RF recall</w:t>
             </w:r>
           </w:p>
         </w:tc>
@@ -3272,7 +2765,7 @@
                 <w:b w:val="0"/>
                 <w:sz w:val="18"/>
               </w:rPr>
-              <w:t>same person as training basis — leaked, ignore</w:t>
+              <w:t>training basis — leaked, ignore</w:t>
             </w:r>
           </w:p>
         </w:tc>
@@ -3304,7 +2797,7 @@
                 <w:b w:val="0"/>
                 <w:sz w:val="18"/>
               </w:rPr>
-              <w:t>0.77</w:t>
+              <w:t>0.68</w:t>
             </w:r>
           </w:p>
         </w:tc>
@@ -3330,41 +2823,169 @@
         <w:pStyle w:val="Heading1"/>
       </w:pPr>
       <w:r>
-        <w:t>6. The two failures</w:t>
+        <w:t>6. The 3 pending-data classes</w:t>
       </w:r>
     </w:p>
     <w:p>
       <w:r>
-        <w:t>rock -&gt; i_love_you (all 102 frames); mini_heart -&gt; heart (40/45).</w:t>
+        <w:t>No public dataset covers these, and s01's execution overlaps a neighbouring class. They are in the vocabulary and in test.npz but the model has no label for them. Their test frames land as:</w:t>
+      </w:r>
+    </w:p>
+    <w:tbl>
+      <w:tblPr>
+        <w:tblStyle w:val="LightGrid-Accent1"/>
+        <w:tblW w:type="auto" w:w="0"/>
+        <w:tblLook w:firstColumn="1" w:firstRow="1" w:lastColumn="0" w:lastRow="0" w:noHBand="0" w:noVBand="1" w:val="04A0"/>
+      </w:tblPr>
+      <w:tblGrid>
+        <w:gridCol w:w="4320"/>
+        <w:gridCol w:w="4320"/>
+      </w:tblGrid>
+      <w:tr>
+        <w:tc>
+          <w:tcPr>
+            <w:tcW w:type="dxa" w:w="4320"/>
+          </w:tcPr>
+          <w:p>
+            <w:r/>
+            <w:r>
+              <w:rPr>
+                <w:b/>
+                <w:sz w:val="18"/>
+              </w:rPr>
+              <w:t>pending class</w:t>
+            </w:r>
+          </w:p>
+        </w:tc>
+        <w:tc>
+          <w:tcPr>
+            <w:tcW w:type="dxa" w:w="4320"/>
+          </w:tcPr>
+          <w:p>
+            <w:r/>
+            <w:r>
+              <w:rPr>
+                <w:b/>
+                <w:sz w:val="18"/>
+              </w:rPr>
+              <w:t>test frames land as (count)</w:t>
+            </w:r>
+          </w:p>
+        </w:tc>
+      </w:tr>
+      <w:tr>
+        <w:tc>
+          <w:tcPr>
+            <w:tcW w:type="dxa" w:w="4320"/>
+          </w:tcPr>
+          <w:p>
+            <w:r/>
+            <w:r>
+              <w:rPr>
+                <w:b w:val="0"/>
+                <w:sz w:val="18"/>
+              </w:rPr>
+              <w:t>i_love_you</w:t>
+            </w:r>
+          </w:p>
+        </w:tc>
+        <w:tc>
+          <w:tcPr>
+            <w:tcW w:type="dxa" w:w="4320"/>
+          </w:tcPr>
+          <w:p>
+            <w:r/>
+            <w:r>
+              <w:rPr>
+                <w:b w:val="0"/>
+                <w:sz w:val="18"/>
+              </w:rPr>
+              <w:t>rock 133, thumb 8</w:t>
+            </w:r>
+          </w:p>
+        </w:tc>
+      </w:tr>
+      <w:tr>
+        <w:tc>
+          <w:tcPr>
+            <w:tcW w:type="dxa" w:w="4320"/>
+          </w:tcPr>
+          <w:p>
+            <w:r/>
+            <w:r>
+              <w:rPr>
+                <w:b w:val="0"/>
+                <w:sz w:val="18"/>
+              </w:rPr>
+              <w:t>heart</w:t>
+            </w:r>
+          </w:p>
+        </w:tc>
+        <w:tc>
+          <w:tcPr>
+            <w:tcW w:type="dxa" w:w="4320"/>
+          </w:tcPr>
+          <w:p>
+            <w:r/>
+            <w:r>
+              <w:rPr>
+                <w:b w:val="0"/>
+                <w:sz w:val="18"/>
+              </w:rPr>
+              <w:t>raise_right_hand 31, ok 28, raise_left_hand 17, glico_pose 8</w:t>
+            </w:r>
+          </w:p>
+        </w:tc>
+      </w:tr>
+      <w:tr>
+        <w:tc>
+          <w:tcPr>
+            <w:tcW w:type="dxa" w:w="4320"/>
+          </w:tcPr>
+          <w:p>
+            <w:r/>
+            <w:r>
+              <w:rPr>
+                <w:b w:val="0"/>
+                <w:sz w:val="18"/>
+              </w:rPr>
+              <w:t>mini_heart</w:t>
+            </w:r>
+          </w:p>
+        </w:tc>
+        <w:tc>
+          <w:tcPr>
+            <w:tcW w:type="dxa" w:w="4320"/>
+          </w:tcPr>
+          <w:p>
+            <w:r/>
+            <w:r>
+              <w:rPr>
+                <w:b w:val="0"/>
+                <w:sz w:val="18"/>
+              </w:rPr>
+              <w:t>raise_right_hand 20, raise_left_hand 16, two_finger 7, thumb 1, t_pose 1</w:t>
+            </w:r>
+          </w:p>
+        </w:tc>
+      </w:tr>
+    </w:tbl>
+    <w:p>
+      <w:r>
+        <w:t>i_love_you -&gt; rock is the s01 overlap (same person did both similarly in one session). heart / mini_heart -&gt; raise_right_hand because hands-overhead reads as a raised arm. Fix = record these gestures from several people, or collect them in Phase 6 field testing.</w:t>
       </w:r>
     </w:p>
     <w:p>
       <w:pPr>
-        <w:pStyle w:val="ListBullet"/>
+        <w:pStyle w:val="Heading1"/>
       </w:pPr>
       <w:r>
-        <w:t>s01-attractor effect: `i_love_you` and `heart` are trained ONLY on augmented s01 frames, so the model over-fits that one person's hand and body. Any other s01 test frame that is geometrically nearby — s01's `rock`, s01's `mini_heart` — gets pulled in.</w:t>
-      </w:r>
-    </w:p>
-    <w:p>
-      <w:pPr>
-        <w:pStyle w:val="ListBullet"/>
-      </w:pPr>
-      <w:r>
-        <w:t>Hand-landmark domain gap: on s01's `rock` the normalised thumb-to-pinky fingertip distance is ~1.3; on HaGRID's `rock` (what the model trained on) it is ~0.5. Palm-width normalisation does not close this — MediaPipe Hands on a tight wrist-crop of a distant robot-camera hand produces a differently proportioned skeleton than on a large frontal webcam hand.</w:t>
-      </w:r>
-    </w:p>
-    <w:p>
-      <w:pPr>
-        <w:pStyle w:val="ListBullet"/>
-      </w:pPr>
-      <w:r>
-        <w:t>mini_heart body position: HaGRID `hand_heart` is a chest-level finger-heart; s01's `mini_heart` is hands-together overhead, which matches s01's `heart` (also overhead).</w:t>
+        <w:t>7. Why the derived features were needed (rock)</w:t>
       </w:r>
     </w:p>
     <w:p>
       <w:r>
-        <w:t>Below: MediaPipe hand landmarks for s01 `rock` (row 1, the misclassified test frames), s01 `i_love_you` (row 2, the aug-only training basis), and HaGRID `rock` (row 3, the actual training data). Rows 1 and 2 are the same person in the same session and are nearly identical in landmark space. Row 3 shows the HaGRID wrist-crop often misses the hand entirely (crop is sized by shoulder width, which is unreliable when the hips are out of frame) — so the model's `rock` knowledge is thin to begin with.</w:t>
+        <w:t>s01 `rock` hand landmarks (row 1) vs s01 `i_love_you` (row 2) vs HaGRID `rock` (row 3). Rows 1-2 are the same person in one session and nearly identical. Row 3 shows the HaGRID wrist-crop often misses the hand (sized by shoulder width, unreliable when hips are out of frame). Scale-invariant angle features + dropping i_love_you from training took `rock` from 0.00 to ~0.85.</w:t>
       </w:r>
     </w:p>
     <w:p>
@@ -3408,7 +3029,7 @@
         <w:pStyle w:val="Heading1"/>
       </w:pPr>
       <w:r>
-        <w:t>7. Top confusions</w:t>
+        <w:t>8. Confusions among the modelled classes</w:t>
       </w:r>
     </w:p>
     <w:tbl>
@@ -3481,100 +3102,6 @@
                 <w:b w:val="0"/>
                 <w:sz w:val="18"/>
               </w:rPr>
-              <w:t>rock</w:t>
-            </w:r>
-          </w:p>
-        </w:tc>
-        <w:tc>
-          <w:tcPr>
-            <w:tcW w:type="dxa" w:w="2880"/>
-          </w:tcPr>
-          <w:p>
-            <w:r/>
-            <w:r>
-              <w:rPr>
-                <w:b w:val="0"/>
-                <w:sz w:val="18"/>
-              </w:rPr>
-              <w:t>i_love_you</w:t>
-            </w:r>
-          </w:p>
-        </w:tc>
-        <w:tc>
-          <w:tcPr>
-            <w:tcW w:type="dxa" w:w="2880"/>
-          </w:tcPr>
-          <w:p>
-            <w:r/>
-            <w:r>
-              <w:rPr>
-                <w:b w:val="0"/>
-                <w:sz w:val="18"/>
-              </w:rPr>
-              <w:t>99</w:t>
-            </w:r>
-          </w:p>
-        </w:tc>
-      </w:tr>
-      <w:tr>
-        <w:tc>
-          <w:tcPr>
-            <w:tcW w:type="dxa" w:w="2880"/>
-          </w:tcPr>
-          <w:p>
-            <w:r/>
-            <w:r>
-              <w:rPr>
-                <w:b w:val="0"/>
-                <w:sz w:val="18"/>
-              </w:rPr>
-              <w:t>mini_heart</w:t>
-            </w:r>
-          </w:p>
-        </w:tc>
-        <w:tc>
-          <w:tcPr>
-            <w:tcW w:type="dxa" w:w="2880"/>
-          </w:tcPr>
-          <w:p>
-            <w:r/>
-            <w:r>
-              <w:rPr>
-                <w:b w:val="0"/>
-                <w:sz w:val="18"/>
-              </w:rPr>
-              <w:t>heart</w:t>
-            </w:r>
-          </w:p>
-        </w:tc>
-        <w:tc>
-          <w:tcPr>
-            <w:tcW w:type="dxa" w:w="2880"/>
-          </w:tcPr>
-          <w:p>
-            <w:r/>
-            <w:r>
-              <w:rPr>
-                <w:b w:val="0"/>
-                <w:sz w:val="18"/>
-              </w:rPr>
-              <w:t>40</w:t>
-            </w:r>
-          </w:p>
-        </w:tc>
-      </w:tr>
-      <w:tr>
-        <w:tc>
-          <w:tcPr>
-            <w:tcW w:type="dxa" w:w="2880"/>
-          </w:tcPr>
-          <w:p>
-            <w:r/>
-            <w:r>
-              <w:rPr>
-                <w:b w:val="0"/>
-                <w:sz w:val="18"/>
-              </w:rPr>
               <w:t>two_finger</w:t>
             </w:r>
           </w:p>
@@ -3590,7 +3117,7 @@
                 <w:b w:val="0"/>
                 <w:sz w:val="18"/>
               </w:rPr>
-              <w:t>i_love_you</w:t>
+              <w:t>rock</w:t>
             </w:r>
           </w:p>
         </w:tc>
@@ -3652,7 +3179,54 @@
                 <w:b w:val="0"/>
                 <w:sz w:val="18"/>
               </w:rPr>
-              <w:t>22</w:t>
+              <w:t>23</w:t>
+            </w:r>
+          </w:p>
+        </w:tc>
+      </w:tr>
+      <w:tr>
+        <w:tc>
+          <w:tcPr>
+            <w:tcW w:type="dxa" w:w="2880"/>
+          </w:tcPr>
+          <w:p>
+            <w:r/>
+            <w:r>
+              <w:rPr>
+                <w:b w:val="0"/>
+                <w:sz w:val="18"/>
+              </w:rPr>
+              <w:t>rock</w:t>
+            </w:r>
+          </w:p>
+        </w:tc>
+        <w:tc>
+          <w:tcPr>
+            <w:tcW w:type="dxa" w:w="2880"/>
+          </w:tcPr>
+          <w:p>
+            <w:r/>
+            <w:r>
+              <w:rPr>
+                <w:b w:val="0"/>
+                <w:sz w:val="18"/>
+              </w:rPr>
+              <w:t>two_finger</w:t>
+            </w:r>
+          </w:p>
+        </w:tc>
+        <w:tc>
+          <w:tcPr>
+            <w:tcW w:type="dxa" w:w="2880"/>
+          </w:tcPr>
+          <w:p>
+            <w:r/>
+            <w:r>
+              <w:rPr>
+                <w:b w:val="0"/>
+                <w:sz w:val="18"/>
+              </w:rPr>
+              <w:t>19</w:t>
             </w:r>
           </w:p>
         </w:tc>
@@ -3699,7 +3273,7 @@
                 <w:b w:val="0"/>
                 <w:sz w:val="18"/>
               </w:rPr>
-              <w:t>12</w:t>
+              <w:t>16</w:t>
             </w:r>
           </w:p>
         </w:tc>
@@ -3746,7 +3320,7 @@
                 <w:b w:val="0"/>
                 <w:sz w:val="18"/>
               </w:rPr>
-              <w:t>11</w:t>
+              <w:t>13</w:t>
             </w:r>
           </w:p>
         </w:tc>
@@ -3793,7 +3367,7 @@
                 <w:b w:val="0"/>
                 <w:sz w:val="18"/>
               </w:rPr>
-              <w:t>10</w:t>
+              <w:t>8</w:t>
             </w:r>
           </w:p>
         </w:tc>
@@ -3840,53 +3414,6 @@
                 <w:b w:val="0"/>
                 <w:sz w:val="18"/>
               </w:rPr>
-              <w:t>6</w:t>
-            </w:r>
-          </w:p>
-        </w:tc>
-      </w:tr>
-      <w:tr>
-        <w:tc>
-          <w:tcPr>
-            <w:tcW w:type="dxa" w:w="2880"/>
-          </w:tcPr>
-          <w:p>
-            <w:r/>
-            <w:r>
-              <w:rPr>
-                <w:b w:val="0"/>
-                <w:sz w:val="18"/>
-              </w:rPr>
-              <w:t>ok</w:t>
-            </w:r>
-          </w:p>
-        </w:tc>
-        <w:tc>
-          <w:tcPr>
-            <w:tcW w:type="dxa" w:w="2880"/>
-          </w:tcPr>
-          <w:p>
-            <w:r/>
-            <w:r>
-              <w:rPr>
-                <w:b w:val="0"/>
-                <w:sz w:val="18"/>
-              </w:rPr>
-              <w:t>i_love_you</w:t>
-            </w:r>
-          </w:p>
-        </w:tc>
-        <w:tc>
-          <w:tcPr>
-            <w:tcW w:type="dxa" w:w="2880"/>
-          </w:tcPr>
-          <w:p>
-            <w:r/>
-            <w:r>
-              <w:rPr>
-                <w:b w:val="0"/>
-                <w:sz w:val="18"/>
-              </w:rPr>
               <w:t>5</w:t>
             </w:r>
           </w:p>
@@ -3904,7 +3431,7 @@
                 <w:b w:val="0"/>
                 <w:sz w:val="18"/>
               </w:rPr>
-              <w:t>rock</w:t>
+              <w:t>raise_left_hand</w:t>
             </w:r>
           </w:p>
         </w:tc>
@@ -3919,7 +3446,101 @@
                 <w:b w:val="0"/>
                 <w:sz w:val="18"/>
               </w:rPr>
-              <w:t>two_finger</w:t>
+              <w:t>idle</w:t>
+            </w:r>
+          </w:p>
+        </w:tc>
+        <w:tc>
+          <w:tcPr>
+            <w:tcW w:type="dxa" w:w="2880"/>
+          </w:tcPr>
+          <w:p>
+            <w:r/>
+            <w:r>
+              <w:rPr>
+                <w:b w:val="0"/>
+                <w:sz w:val="18"/>
+              </w:rPr>
+              <w:t>4</w:t>
+            </w:r>
+          </w:p>
+        </w:tc>
+      </w:tr>
+      <w:tr>
+        <w:tc>
+          <w:tcPr>
+            <w:tcW w:type="dxa" w:w="2880"/>
+          </w:tcPr>
+          <w:p>
+            <w:r/>
+            <w:r>
+              <w:rPr>
+                <w:b w:val="0"/>
+                <w:sz w:val="18"/>
+              </w:rPr>
+              <w:t>sit</w:t>
+            </w:r>
+          </w:p>
+        </w:tc>
+        <w:tc>
+          <w:tcPr>
+            <w:tcW w:type="dxa" w:w="2880"/>
+          </w:tcPr>
+          <w:p>
+            <w:r/>
+            <w:r>
+              <w:rPr>
+                <w:b w:val="0"/>
+                <w:sz w:val="18"/>
+              </w:rPr>
+              <w:t>thumb</w:t>
+            </w:r>
+          </w:p>
+        </w:tc>
+        <w:tc>
+          <w:tcPr>
+            <w:tcW w:type="dxa" w:w="2880"/>
+          </w:tcPr>
+          <w:p>
+            <w:r/>
+            <w:r>
+              <w:rPr>
+                <w:b w:val="0"/>
+                <w:sz w:val="18"/>
+              </w:rPr>
+              <w:t>3</w:t>
+            </w:r>
+          </w:p>
+        </w:tc>
+      </w:tr>
+      <w:tr>
+        <w:tc>
+          <w:tcPr>
+            <w:tcW w:type="dxa" w:w="2880"/>
+          </w:tcPr>
+          <w:p>
+            <w:r/>
+            <w:r>
+              <w:rPr>
+                <w:b w:val="0"/>
+                <w:sz w:val="18"/>
+              </w:rPr>
+              <w:t>raise_right_hand</w:t>
+            </w:r>
+          </w:p>
+        </w:tc>
+        <w:tc>
+          <w:tcPr>
+            <w:tcW w:type="dxa" w:w="2880"/>
+          </w:tcPr>
+          <w:p>
+            <w:r/>
+            <w:r>
+              <w:rPr>
+                <w:b w:val="0"/>
+                <w:sz w:val="18"/>
+              </w:rPr>
+              <w:t>raise_left_hand</w:t>
             </w:r>
           </w:p>
         </w:tc>
@@ -3941,11 +3562,16 @@
       </w:tr>
     </w:tbl>
     <w:p>
+      <w:r>
+        <w:t>The residual confusions are sensible: rock&lt;-&gt;two_finger (adjacent handshapes), and several gestures -&gt; idle at ~0.7 recall — a frame where the hand isn't clearly detected falls to idle. idle precision is ~0.45 for the same reason. Phase 5 temporal smoothing (majority vote over N frames) recovers most of this: a gesture held for ~1 s is ~30 frames.</w:t>
+      </w:r>
+    </w:p>
+    <w:p>
       <w:pPr>
         <w:pStyle w:val="Heading1"/>
       </w:pPr>
       <w:r>
-        <w:t>8. Phase 4 plan</w:t>
+        <w:t>9. Phase 4 (model exploration on this fixed pipeline)</w:t>
       </w:r>
     </w:p>
     <w:p>
@@ -3953,7 +3579,7 @@
         <w:pStyle w:val="ListBullet"/>
       </w:pPr>
       <w:r>
-        <w:t>1. Close the hand-landmark domain gap — add hand-scale + hand-rotation jitter to features/augment.py, or canonicalise hand orientation in normalize_hand, or switch to joint-angle features (scale-free, would sidestep it entirely). IMPLEMENTATION_PLAN Phase 4 already calls for the raw-coords vs derived-features comparison.</w:t>
+        <w:t>1. Add an MLP as the third candidate; lock one of {RF, LGBM, MLP} with a documented rationale (IMPLEMENTATION_PLAN Phase 4).</w:t>
       </w:r>
     </w:p>
     <w:p>
@@ -3961,7 +3587,7 @@
         <w:pStyle w:val="ListBullet"/>
       </w:pPr>
       <w:r>
-        <w:t>2. Stop `i_love_you` / `heart` poisoning neighbours — raise their per-class confidence threshold, down-weight them, or find real data (none exists for the ASL ILY handshape; HaGRID's heart is the wrong pose).</w:t>
+        <w:t>2. Compare feature sets properly: raw vs derived vs both (the flag exists).</w:t>
       </w:r>
     </w:p>
     <w:p>
@@ -3969,7 +3595,7 @@
         <w:pStyle w:val="ListBullet"/>
       </w:pPr>
       <w:r>
-        <w:t>3. mini_heart — drop the HaGRID chest-level data and treat as aug-only, or add an overhead-position augmentation.</w:t>
+        <w:t>3. Tune per-class confidence thresholds on a validation slice, then wire the idle/unknown fallback (Phase 3 deliverable, carried into Phase 5).</w:t>
       </w:r>
     </w:p>
     <w:p>
@@ -3977,7 +3603,7 @@
         <w:pStyle w:val="ListBullet"/>
       </w:pPr>
       <w:r>
-        <w:t>4. idle over-triggers (precision 0.48) — tune the idle threshold on a validation slice; the `call`-&gt;idle hard-negatives may be too aggressive.</w:t>
+        <w:t>4. Re-extract COCO with a person-bbox crop — COCO gives the bbox; cropping to it before MediaPipe should lift raise_hand / t_pose recall (now ~0.72) by removing the wrong-person detections.</w:t>
       </w:r>
     </w:p>
     <w:p>
@@ -3985,7 +3611,7 @@
         <w:pStyle w:val="ListBullet"/>
       </w:pPr>
       <w:r>
-        <w:t>5. Re-run the LightGBM vs RF vs MLP comparison once the features are fixed, then lock one config (Phase 4 deliverable).</w:t>
+        <w:t>5. Revisit i_love_you / heart / mini_heart only with new recordings or Phase 6 field data.</w:t>
       </w:r>
     </w:p>
     <w:sectPr>

</xml_diff>